<commit_message>
schema test code + template engine changes
</commit_message>
<xml_diff>
--- a/tmpl_gen/sample-templ/2026-02-18/templates-aligned-2026-02.docx
+++ b/tmpl_gen/sample-templ/2026-02-18/templates-aligned-2026-02.docx
@@ -32,15 +32,7 @@
       </w:pPr>
       <w:r>
         <w:rPr/>
-        <w:t>2/1</w:t>
-      </w:r>
-      <w:r>
-        <w:rPr/>
-        <w:t>9</w:t>
-      </w:r>
-      <w:r>
-        <w:rPr/>
-        <w:t>/2026</w:t>
+        <w:t>2/19/2026</w:t>
       </w:r>
     </w:p>
     <w:p>
@@ -146,9 +138,93 @@
         <w:pStyle w:val="BodyText"/>
         <w:rPr/>
       </w:pPr>
-      <w:r>
-        <w:rPr/>
-        <w:t>1.3 Instruction: You are a CTI expert that gives precise and concise answers. Question: Which data component is used to detect the attack pattern {ap:dc.detects.name} and what is the detection logic?  Answer: The attack pattern {ap.name} ({ap.id}) can be detected using the data component {dc:x-mitre-data-component.name}. Its description is: {dc.description}.</w:t>
+      <w:commentRangeStart w:id="0"/>
+      <w:r>
+        <w:rPr/>
+        <w:t>1.3 Instruction</w:t>
+      </w:r>
+      <w:r>
+        <w:rPr/>
+      </w:r>
+      <w:commentRangeEnd w:id="0"/>
+      <w:r>
+        <w:commentReference w:id="0"/>
+      </w:r>
+      <w:r>
+        <w:rPr/>
+        <w:t>: You are a CTI expert that gives precise and concise answers. Question: Which data component is used to detect the attack pattern {ap.name} and what is the detection logic?  Answer: The attack pattern {ap:</w:t>
+      </w:r>
+      <w:r>
+        <w:rPr/>
+        <w:t>attack-pattern</w:t>
+      </w:r>
+      <w:r>
+        <w:rPr/>
+        <w:t>.name} (</w:t>
+      </w:r>
+      <w:r>
+        <w:rPr/>
+        <w:t xml:space="preserve">ID </w:t>
+      </w:r>
+      <w:r>
+        <w:rPr/>
+        <w:t xml:space="preserve">{ap.id}) can be detected </w:t>
+      </w:r>
+      <w:r>
+        <w:rPr/>
+        <w:t xml:space="preserve">with detection strategy {det:ap.detects&lt;detection-strategy.name} </w:t>
+      </w:r>
+      <w:r>
+        <w:rPr/>
+        <w:t xml:space="preserve">({det.id}) </w:t>
+      </w:r>
+      <w:r>
+        <w:rPr/>
+        <w:t xml:space="preserve">and </w:t>
+      </w:r>
+      <w:r>
+        <w:rPr/>
+        <w:t xml:space="preserve">a </w:t>
+      </w:r>
+      <w:r>
+        <w:rPr/>
+        <w:t>corresonding analytic {an:</w:t>
+      </w:r>
+      <w:r>
+        <w:rPr/>
+        <w:t>det.implemented_by.name</w:t>
+      </w:r>
+      <w:r>
+        <w:rPr/>
+        <w:t xml:space="preserve">} </w:t>
+      </w:r>
+      <w:r>
+        <w:rPr/>
+        <w:t xml:space="preserve">(an.id) on platforms: {an.platforms}. This analytic which uses </w:t>
+      </w:r>
+      <w:r>
+        <w:rPr/>
+        <w:t>data component {dc:</w:t>
+      </w:r>
+      <w:r>
+        <w:rPr/>
+        <w:t>an.requires_data</w:t>
+      </w:r>
+      <w:r>
+        <w:rPr/>
+        <w:t xml:space="preserve">.name}, </w:t>
+      </w:r>
+      <w:r>
+        <w:rPr/>
+        <w:t xml:space="preserve">described by: </w:t>
+      </w:r>
+      <w:r>
+        <w:rPr/>
+        <w:t xml:space="preserve">{dc.description}. </w:t>
+      </w:r>
+      <w:r>
+        <w:rPr/>
+        <w:t>The detection logic is the following: {an.description}</w:t>
       </w:r>
     </w:p>
     <w:p>
@@ -168,7 +244,13 @@
       </w:pPr>
       <w:r>
         <w:rPr/>
-        <w:t>Schema: x-mitre-data-component - detects - attack-pattern</w:t>
+        <w:t xml:space="preserve">Schema: x-mitre-detection-strategy - detects - attack-pattern, </w:t>
+      </w:r>
+      <w:r>
+        <w:rPr>
+          <w:lang w:val="en-US" w:eastAsia="zh-CN" w:bidi="hi-IN"/>
+        </w:rPr>
+        <w:t>x-mitre-analytic - requires_data - x-mitre-data-component, x-mitre-detection-strategy -  implemented_by - x-mitre-analytic</w:t>
       </w:r>
     </w:p>
     <w:p>
@@ -305,15 +387,7 @@
       </w:pPr>
       <w:r>
         <w:rPr/>
-        <w:t>1.9 Instruction: You are a CTI expert that gives precise and concise answers. Question: In which kill chain phase does the technique {ap:attack-pattern.name} operate? Answer: The technique {ap.name} ({ap.id}) is associated with the {tac:ap.achieve</w:t>
-      </w:r>
-      <w:r>
-        <w:rPr/>
-        <w:t>s</w:t>
-      </w:r>
-      <w:r>
-        <w:rPr/>
-        <w:t>.name} tactic. Its primary function is: {ap.description}</w:t>
+        <w:t>1.9 Instruction: You are a CTI expert that gives precise and concise answers. Question: In which kill chain phase does the technique {ap:attack-pattern.name} operate? Answer: The technique {ap.name} ({ap.id}) is associated with the {tac:ap.achieves.name} tactic. Its primary function is: {ap.description}</w:t>
       </w:r>
     </w:p>
     <w:p>
@@ -388,29 +462,92 @@
         <w:pStyle w:val="BodyText"/>
         <w:rPr/>
       </w:pPr>
-      <w:r>
-        <w:rPr/>
-        <w:t>2.2 Instruction: You are a CTI expert that gives precise and concise answers. Question: How can a CTI analyst detect the technique {ap:dc.detects.name} (ID {ap.id}) using {dc:x-mitre-data-component.name}? Answer: To detect technique {ap:dc.detects.name}, monitor {dc.name}. Detection logic: {dc.description}</w:t>
-      </w:r>
-    </w:p>
-    <w:p>
-      <w:pPr>
-        <w:pStyle w:val="BodyText"/>
-        <w:rPr/>
-      </w:pPr>
-      <w:r>
-        <w:rPr/>
-        <w:t>Summary: {dc.detects|description}</w:t>
-      </w:r>
-    </w:p>
-    <w:p>
-      <w:pPr>
-        <w:pStyle w:val="BodyText"/>
-        <w:rPr/>
-      </w:pPr>
-      <w:r>
-        <w:rPr/>
-        <w:t>Schema: x-mitre-data-component - detects - attack-pattern</w:t>
+      <w:commentRangeStart w:id="1"/>
+      <w:r>
+        <w:rPr/>
+        <w:t>2.2 Instruction</w:t>
+      </w:r>
+      <w:r>
+        <w:rPr/>
+      </w:r>
+      <w:commentRangeEnd w:id="1"/>
+      <w:r>
+        <w:commentReference w:id="1"/>
+      </w:r>
+      <w:r>
+        <w:rPr/>
+        <w:t>: You are a CTI expert that gives precise and concise answers. Question: How can a CTI analyst detect the technique {ap:</w:t>
+      </w:r>
+      <w:r>
+        <w:rPr/>
+        <w:t>attack-pattern</w:t>
+      </w:r>
+      <w:r>
+        <w:rPr/>
+        <w:t xml:space="preserve">.name} (ID {ap.id}) using </w:t>
+      </w:r>
+      <w:r>
+        <w:rPr/>
+        <w:t xml:space="preserve">data component </w:t>
+      </w:r>
+      <w:r>
+        <w:rPr/>
+        <w:t xml:space="preserve">{dc.name}? Answer: To detect technique {ap.name}, monitor {dc.name}. </w:t>
+      </w:r>
+      <w:r>
+        <w:rPr/>
+        <w:t>Apply detection strategy {det:ap.detects&lt;.name} ({det.id}), more specifically, analytic {an:</w:t>
+      </w:r>
+      <w:r>
+        <w:rPr/>
+        <w:t>det.implemented_by.name</w:t>
+      </w:r>
+      <w:r>
+        <w:rPr/>
+        <w:t xml:space="preserve">} </w:t>
+      </w:r>
+      <w:r>
+        <w:rPr/>
+        <w:t xml:space="preserve">({an.id}), which requires data component (log source) {dc:an.requires.name}. </w:t>
+      </w:r>
+      <w:r>
+        <w:rPr/>
+        <w:t xml:space="preserve"> </w:t>
+      </w:r>
+      <w:r>
+        <w:rPr/>
+        <w:t>Analytic description</w:t>
+      </w:r>
+      <w:r>
+        <w:rPr/>
+        <w:t>: {</w:t>
+      </w:r>
+      <w:r>
+        <w:rPr/>
+        <w:t>an</w:t>
+      </w:r>
+      <w:r>
+        <w:rPr/>
+        <w:t>.description}</w:t>
+      </w:r>
+    </w:p>
+    <w:p>
+      <w:pPr>
+        <w:pStyle w:val="BodyText"/>
+        <w:rPr/>
+      </w:pPr>
+      <w:r>
+        <w:rPr/>
+        <w:t>Schema: x-mitre-detection-strategy - detects - attack-pattern, x-mitre-analytic - requires_data - x-mitre-data-component, x-mitre-detection-strategy -  implemented_by - x-mitre-analytic</w:t>
+      </w:r>
+    </w:p>
+    <w:p>
+      <w:pPr>
+        <w:pStyle w:val="BodyText"/>
+        <w:rPr/>
+      </w:pPr>
+      <w:r>
+        <w:rPr/>
       </w:r>
     </w:p>
     <w:p>
@@ -459,33 +596,17 @@
       </w:pPr>
       <w:r>
         <w:rPr/>
-        <w:t>2.4 Instruction: You are a CTI expert that gives precise and concise answers. Question: What is a recommended mitigation or course of action to counter the technique {ap:attack-pattern.name} (ID {ap.id})? Answer: mitigation {coa:ap.mitigate</w:t>
-      </w:r>
-      <w:r>
-        <w:rPr/>
-        <w:t>s&lt;</w:t>
-      </w:r>
-      <w:r>
-        <w:rPr/>
-        <w:t>.name} is recommended. Mitigation description: {coa.description}</w:t>
-      </w:r>
-    </w:p>
-    <w:p>
-      <w:pPr>
-        <w:pStyle w:val="BodyText"/>
-        <w:rPr/>
-      </w:pPr>
-      <w:r>
-        <w:rPr/>
-        <w:t>Summary: {ap.mitigate</w:t>
-      </w:r>
-      <w:r>
-        <w:rPr/>
-        <w:t>s&lt;</w:t>
-      </w:r>
-      <w:r>
-        <w:rPr/>
-        <w:t>|description}</w:t>
+        <w:t>2.4 Instruction: You are a CTI expert that gives precise and concise answers. Question: What is a recommended mitigation or course of action to counter the technique {ap:attack-pattern.name} (ID {ap.id})? Answer: mitigation {coa:ap.mitigates&lt;.name} is recommended. Mitigation description: {coa.description}</w:t>
+      </w:r>
+    </w:p>
+    <w:p>
+      <w:pPr>
+        <w:pStyle w:val="BodyText"/>
+        <w:rPr/>
+      </w:pPr>
+      <w:r>
+        <w:rPr/>
+        <w:t>Summary: {ap.mitigates&lt;|description}</w:t>
       </w:r>
     </w:p>
     <w:p>
@@ -524,7 +645,7 @@
       </w:r>
       <w:r>
         <w:rPr/>
-        <w:commentReference w:id="0"/>
+        <w:commentReference w:id="2"/>
       </w:r>
       <w:r>
         <w:rPr>
@@ -604,33 +725,17 @@
         <w:rPr/>
         <w:t xml:space="preserve">2.8 Instruction: You are a CTI expert that gives precise and concise answers. Question: To which kill chain phase (tactic) does the technique {ap:attack-pattern.name} (id {ap.id}) belong, and what is its objective? Answer: Technique {ap.name} is part of the </w:t>
       </w:r>
-      <w:commentRangeStart w:id="1"/>
-      <w:r>
-        <w:rPr/>
-        <w:t>{ap.achiev</w:t>
-      </w:r>
-      <w:r>
-        <w:rPr/>
-        <w:t>es</w:t>
-      </w:r>
-      <w:r>
-        <w:rPr/>
-        <w:t>.name</w:t>
-      </w:r>
-      <w:r>
-        <w:rPr/>
-        <w:t xml:space="preserve">} </w:t>
-      </w:r>
-      <w:r>
-        <w:rPr/>
-        <w:t>phase</w:t>
-      </w:r>
-      <w:r>
-        <w:rPr/>
-      </w:r>
-      <w:commentRangeEnd w:id="1"/>
-      <w:r>
-        <w:commentReference w:id="1"/>
+      <w:commentRangeStart w:id="3"/>
+      <w:r>
+        <w:rPr/>
+        <w:t>{ap.achieves.name} phase</w:t>
+      </w:r>
+      <w:r>
+        <w:rPr/>
+      </w:r>
+      <w:commentRangeEnd w:id="3"/>
+      <w:r>
+        <w:commentReference w:id="3"/>
       </w:r>
       <w:r>
         <w:rPr/>
@@ -705,7 +810,7 @@
       </w:r>
       <w:r>
         <w:rPr/>
-        <w:commentReference w:id="2"/>
+        <w:commentReference w:id="4"/>
       </w:r>
       <w:r>
         <w:rPr>
@@ -756,7 +861,7 @@
         <w:rPr/>
         <w:t xml:space="preserve">3.2 Instruction: You are a CTI expert that gives precise and concise answers. Question: What is the most effective mitigation for the technique {ap:attack-pattern.name} (id {ap.id}) to reduce </w:t>
       </w:r>
-      <w:commentRangeStart w:id="3"/>
+      <w:commentRangeStart w:id="5"/>
       <w:r>
         <w:rPr>
           <w:shd w:fill="FFFF00" w:val="clear"/>
@@ -768,466 +873,466 @@
           <w:shd w:fill="FFFF00" w:val="clear"/>
         </w:rPr>
       </w:r>
-      <w:commentRangeEnd w:id="3"/>
-      <w:r>
-        <w:commentReference w:id="3"/>
-      </w:r>
-      <w:r>
-        <w:rPr/>
-        <w:t xml:space="preserve">? Answer: To mitigate {ap.name}, organizations should implement course of action {coa:ap.mitigated_by.name} (id{coa.id}). Description of mitigation: {coa.description} </w:t>
-      </w:r>
-      <w:commentRangeStart w:id="4"/>
+      <w:commentRangeEnd w:id="5"/>
+      <w:r>
+        <w:commentReference w:id="5"/>
+      </w:r>
+      <w:r>
+        <w:rPr/>
+        <w:t>? Answer: To mitigate {ap.name}, organizations should implement course of action {coa:ap.mitigated_by.name} (id{coa.id}). Description of mitigation: {coa.description[</w:t>
+      </w:r>
+      <w:commentRangeStart w:id="6"/>
+      <w:r>
+        <w:rPr/>
+        <w:t>_~"organizational risk"</w:t>
+      </w:r>
+      <w:r>
+        <w:rPr/>
+      </w:r>
+      <w:commentRangeEnd w:id="6"/>
+      <w:r>
+        <w:commentReference w:id="6"/>
+      </w:r>
+      <w:r>
+        <w:rPr/>
+        <w:t>]}.</w:t>
+      </w:r>
+    </w:p>
+    <w:p>
+      <w:pPr>
+        <w:pStyle w:val="BodyText"/>
+        <w:rPr/>
+      </w:pPr>
+      <w:r>
+        <w:rPr/>
+        <w:t>Summary: {ap.mitigated_by|description}</w:t>
+      </w:r>
+    </w:p>
+    <w:p>
+      <w:pPr>
+        <w:pStyle w:val="BodyText"/>
+        <w:rPr/>
+      </w:pPr>
+      <w:r>
+        <w:rPr/>
+        <w:t>Schema: course-of-action - mitigates - attack-pattern</w:t>
+      </w:r>
+    </w:p>
+    <w:p>
+      <w:pPr>
+        <w:pStyle w:val="BodyText"/>
+        <w:rPr/>
+      </w:pPr>
+      <w:r>
+        <w:rPr/>
+      </w:r>
+    </w:p>
+    <w:p>
+      <w:pPr>
+        <w:pStyle w:val="BodyText"/>
+        <w:rPr/>
+      </w:pPr>
+      <w:commentRangeStart w:id="7"/>
+      <w:r>
+        <w:rPr/>
+        <w:t>3.3 Instruction</w:t>
+      </w:r>
+      <w:r>
+        <w:rPr/>
+      </w:r>
+      <w:commentRangeEnd w:id="7"/>
+      <w:r>
+        <w:commentReference w:id="7"/>
+      </w:r>
+      <w:r>
+        <w:rPr/>
+        <w:t>: You are a CTI expert that gives precise and concise answers. Question: In the context of {ap:</w:t>
+      </w:r>
+      <w:r>
+        <w:rPr/>
+        <w:t>attack-pattern</w:t>
+      </w:r>
+      <w:r>
+        <w:rPr/>
+        <w:t>.name} (ID {ap.id}), which data component should be monitored for specialized system call or API usage? Answer: To detect this technique, you should monitor data component {dc.</w:t>
+      </w:r>
+      <w:r>
+        <w:rPr/>
+        <w:t>name</w:t>
+      </w:r>
+      <w:r>
+        <w:rPr/>
+        <w:t>}. Its description is: {dc.description</w:t>
+      </w:r>
       <w:r>
         <w:rPr>
           <w:shd w:fill="FFFF00" w:val="clear"/>
         </w:rPr>
-        <w:t>&lt;*</w:t>
-      </w:r>
+        <w:t>[_~"system call"]</w:t>
+      </w:r>
+      <w:r>
+        <w:rPr/>
+        <w:t xml:space="preserve">}. </w:t>
+      </w:r>
+      <w:r>
+        <w:rPr/>
+        <w:t xml:space="preserve">This is because technique {ap.name} is detected with detection strategy {det:ap.detects&lt;name} (det.id), specifically, with analytic {an:det.implemented_by.name}, which requires data component (log source) {dc:an.requires_data.name}.  </w:t>
+      </w:r>
+    </w:p>
+    <w:p>
+      <w:pPr>
+        <w:pStyle w:val="BodyText"/>
+        <w:rPr/>
+      </w:pPr>
+      <w:r>
+        <w:rPr/>
+        <w:t>Schema: x-mitre-detection-strategy - detects - attack-pattern, x-mitre-analytic - requires_data - x-mitre-data-component, x-mitre-detection-strategy -  implemented_by - x-mitre-analytic</w:t>
+      </w:r>
+    </w:p>
+    <w:p>
+      <w:pPr>
+        <w:pStyle w:val="BodyText"/>
+        <w:rPr/>
+      </w:pPr>
+      <w:r>
+        <w:rPr/>
+      </w:r>
+    </w:p>
+    <w:p>
+      <w:pPr>
+        <w:pStyle w:val="BodyText"/>
+        <w:rPr/>
+      </w:pPr>
+      <w:r>
+        <w:rPr/>
+        <w:t>3.4 Instruction: You are a CTI expert that gives precise and concise answers. Question: How does the malware {m:malware.name} (ID {m.id}) implement the technique {ap:m.uses.name} during its operations? Answer: {m.name} utilizes technique {ap.name} as follows: {ap.description} This is often seen on {m.x_mitre_platforms} platforms.</w:t>
+      </w:r>
+    </w:p>
+    <w:p>
+      <w:pPr>
+        <w:pStyle w:val="BodyText"/>
+        <w:rPr/>
+      </w:pPr>
+      <w:r>
+        <w:rPr/>
+        <w:t>Summary: {m.uses|description}</w:t>
+      </w:r>
+    </w:p>
+    <w:p>
+      <w:pPr>
+        <w:pStyle w:val="BodyText"/>
+        <w:rPr/>
+      </w:pPr>
+      <w:r>
+        <w:rPr/>
+        <w:t>Schema: malware - uses - attack-pattern</w:t>
+      </w:r>
+    </w:p>
+    <w:p>
+      <w:pPr>
+        <w:pStyle w:val="BodyText"/>
+        <w:rPr/>
+      </w:pPr>
+      <w:r>
+        <w:rPr/>
+      </w:r>
+    </w:p>
+    <w:p>
+      <w:pPr>
+        <w:pStyle w:val="BodyText"/>
+        <w:rPr/>
+      </w:pPr>
+      <w:r>
+        <w:rPr/>
+        <w:t xml:space="preserve">3.6 Instruction: You are a CTI expert that gives precise and concise answers. Question: Explain the characteristics of {ap:attack-pattern.name} (id {ap.id}) </w:t>
+      </w:r>
+      <w:commentRangeStart w:id="8"/>
       <w:r>
         <w:rPr>
           <w:shd w:fill="FFFF00" w:val="clear"/>
         </w:rPr>
-      </w:r>
-      <w:commentRangeEnd w:id="4"/>
-      <w:r>
-        <w:commentReference w:id="4"/>
-      </w:r>
-      <w:r>
-        <w:rPr/>
-        <w:t xml:space="preserve"> {coa.description[</w:t>
-      </w:r>
-      <w:commentRangeStart w:id="5"/>
-      <w:r>
-        <w:rPr/>
-        <w:t>_^"organizational risk"</w:t>
-      </w:r>
-      <w:r>
-        <w:rPr/>
-      </w:r>
-      <w:commentRangeEnd w:id="5"/>
-      <w:r>
-        <w:commentReference w:id="5"/>
-      </w:r>
-      <w:r>
-        <w:rPr/>
-        <w:t xml:space="preserve">]} *&gt;  </w:t>
-      </w:r>
-    </w:p>
-    <w:p>
-      <w:pPr>
-        <w:pStyle w:val="BodyText"/>
-        <w:rPr/>
-      </w:pPr>
-      <w:r>
-        <w:rPr/>
-        <w:t>Summary: {ap.mitigated_by|description}</w:t>
-      </w:r>
-    </w:p>
-    <w:p>
-      <w:pPr>
-        <w:pStyle w:val="BodyText"/>
-        <w:rPr/>
-      </w:pPr>
-      <w:r>
-        <w:rPr/>
-        <w:t>Schema: course-of-action - mitigates - attack-pattern</w:t>
-      </w:r>
-    </w:p>
-    <w:p>
-      <w:pPr>
-        <w:pStyle w:val="BodyText"/>
-        <w:rPr/>
-      </w:pPr>
-      <w:r>
-        <w:rPr/>
-      </w:r>
-    </w:p>
-    <w:p>
-      <w:pPr>
-        <w:pStyle w:val="BodyText"/>
-        <w:rPr/>
-      </w:pPr>
-      <w:r>
-        <w:rPr/>
-        <w:t>3.3 Instruction: You are a CTI expert that gives precise and concise answers. Question: In the context of {ap:dc.detects.name} (ID {ap.id}), which data component should be monitored for specialized system call or API usage? Answer: To detect this technique, you should monitor data component {dc:x-mitre-data-component.name}.  Its description is: {dc.description</w:t>
+        <w:t>specifically regarding how it handles data encryption or protocol blending</w:t>
       </w:r>
       <w:r>
         <w:rPr>
           <w:shd w:fill="FFFF00" w:val="clear"/>
         </w:rPr>
-        <w:t>[_^"system call"</w:t>
-      </w:r>
-      <w:r>
-        <w:rPr>
-          <w:shd w:fill="FFFF00" w:val="clear"/>
-        </w:rPr>
+      </w:r>
+      <w:commentRangeEnd w:id="8"/>
+      <w:r>
+        <w:commentReference w:id="8"/>
+      </w:r>
+      <w:r>
+        <w:rPr/>
+        <w:t>. Answer: {ap.name} involves  these steps: {ap.description} Detection often relies on this method: {ap.x_mitre_detection}.</w:t>
+      </w:r>
+    </w:p>
+    <w:p>
+      <w:pPr>
+        <w:pStyle w:val="BodyText"/>
+        <w:rPr/>
+      </w:pPr>
+      <w:r>
+        <w:rPr/>
+      </w:r>
+    </w:p>
+    <w:p>
+      <w:pPr>
+        <w:pStyle w:val="BodyText"/>
+        <w:rPr/>
+      </w:pPr>
+      <w:commentRangeStart w:id="9"/>
+      <w:r>
+        <w:rPr/>
+        <w:t>3.6 Instruction</w:t>
+      </w:r>
+      <w:r>
+        <w:rPr/>
+      </w:r>
+      <w:commentRangeEnd w:id="9"/>
+      <w:r>
+        <w:commentReference w:id="9"/>
+      </w:r>
+      <w:r>
+        <w:rPr/>
+        <w:t>: You are a CTI expert that gives precise and concise answers. Question: Explain the characteristics of {ap:attack-pattern.name} (id {ap.id}. Answer: {ap.name} involves {ap.description} Detection often relies on {ap.x_mitre_detection}</w:t>
+      </w:r>
+    </w:p>
+    <w:p>
+      <w:pPr>
+        <w:pStyle w:val="BodyText"/>
+        <w:rPr/>
+      </w:pPr>
+      <w:r>
+        <w:rPr/>
+      </w:r>
+    </w:p>
+    <w:p>
+      <w:pPr>
+        <w:pStyle w:val="BodyText"/>
+        <w:rPr/>
+      </w:pPr>
+      <w:r>
+        <w:rPr/>
+        <w:t>3.7 Instruction: You are a CTI expert that gives precise and concise answers. Question: To which MITRE ATT&amp;CK tactic does the technique {ap:attack-pattern.name} (ID {ap.id}) belong, and what is the adversary's primary goal in this phase? Answer: {ap.name} maps to the {tac:ap.achieves.name} tactic. Its goal and description is {ap.description}</w:t>
+      </w:r>
+    </w:p>
+    <w:p>
+      <w:pPr>
+        <w:pStyle w:val="BodyText"/>
+        <w:rPr/>
+      </w:pPr>
+      <w:r>
+        <w:rPr/>
+        <w:t>Schema: attack-pattern - achieves - x-mitre-tactic</w:t>
+      </w:r>
+    </w:p>
+    <w:p>
+      <w:pPr>
+        <w:pStyle w:val="BodyText"/>
+        <w:rPr/>
+      </w:pPr>
+      <w:r>
+        <w:rPr/>
+      </w:r>
+    </w:p>
+    <w:p>
+      <w:pPr>
+        <w:pStyle w:val="BodyText"/>
+        <w:rPr/>
+      </w:pPr>
+      <w:commentRangeStart w:id="10"/>
+      <w:r>
+        <w:rPr/>
+        <w:t xml:space="preserve">3.8 Instruction: </w:t>
+      </w:r>
+      <w:r>
+        <w:rPr/>
+      </w:r>
+      <w:commentRangeEnd w:id="10"/>
+      <w:r>
+        <w:commentReference w:id="10"/>
+      </w:r>
+      <w:r>
+        <w:rPr/>
+        <w:t>You are a CTI expert that gives precise and concise answers. Question: Which mechanisms are leveraged by {tl:tool.name} (ID {tl.id}) whan used for technique {ap:tl.uses.name}? Answer: The tool {tl.name} is used to execute attack pattern {ap.name} (ID {ap.id}), that generally targets these platforms: {ap.x_mitre_platforms}. The technique proceeds as follows: {ap.description}.</w:t>
+      </w:r>
+    </w:p>
+    <w:p>
+      <w:pPr>
+        <w:pStyle w:val="BodyText"/>
+        <w:rPr/>
+      </w:pPr>
+      <w:r>
+        <w:rPr/>
+        <w:t>Summary: {tl.uses|description}</w:t>
+      </w:r>
+    </w:p>
+    <w:p>
+      <w:pPr>
+        <w:pStyle w:val="BodyText"/>
+        <w:rPr/>
+      </w:pPr>
+      <w:r>
+        <w:rPr/>
+        <w:t>Schema: tool - uses - attack-pattern</w:t>
+      </w:r>
+    </w:p>
+    <w:p>
+      <w:pPr>
+        <w:pStyle w:val="BodyText"/>
+        <w:rPr/>
+      </w:pPr>
+      <w:r>
+        <w:rPr/>
+      </w:r>
+    </w:p>
+    <w:p>
+      <w:pPr>
+        <w:pStyle w:val="BodyText"/>
+        <w:rPr/>
+      </w:pPr>
+      <w:r>
+        <w:rPr/>
+        <w:t>3.9 Instruction: You are a CTI expert that gives precise and concise answers. Question: Give a technique that uses methods to evade detection. Answer: Attack pattern {ap:attack-pattern.name} (id {ap.id}) uses methods to evade detection, as described below: {ap.description[_~"evade detection"]}. Analysts should look for {ap.x_mitre_detection}.</w:t>
+      </w:r>
+    </w:p>
+    <w:p>
+      <w:pPr>
+        <w:pStyle w:val="BodyText"/>
+        <w:rPr/>
+      </w:pPr>
+      <w:r>
+        <w:rPr/>
+      </w:r>
+    </w:p>
+    <w:p>
+      <w:pPr>
+        <w:pStyle w:val="BodyText"/>
+        <w:rPr/>
+      </w:pPr>
+      <w:r>
+        <w:rPr/>
+        <w:t>3.9a Instruction: You are a CTI expert that gives precise and concise answers. Question: Give a technique that uses methods to bypass security controls. Answer: Attack pattern {ap:attack-pattern.name} (id {ap.id}) uses methods to bypass security controls, as described below: {ap.description[_~"bypass security controls"]}. Analysts should look for {ap.x_mitre_detection}.</w:t>
+      </w:r>
+    </w:p>
+    <w:p>
+      <w:pPr>
+        <w:pStyle w:val="BodyText"/>
+        <w:rPr/>
+      </w:pPr>
+      <w:r>
+        <w:rPr/>
+      </w:r>
+    </w:p>
+    <w:p>
+      <w:pPr>
+        <w:pStyle w:val="BodyText"/>
+        <w:rPr/>
+      </w:pPr>
+      <w:r>
+        <w:rPr/>
+        <w:t>3.10 Instruction: You are a CTI expert that gives precise and concise answers. Question: Describe the artifacts left behind when technique {ap.name} ({ap.id}) is executed on {ap.x_mitre_platforms}. Answer: On {ap.x_mitre_platforms}, the execution of {ap.name} involves the following: {ap.description} Consider the following for detection: {ap:attack-pattern.x_mitre_detection}</w:t>
+      </w:r>
+    </w:p>
+    <w:p>
+      <w:pPr>
+        <w:pStyle w:val="BodyText"/>
+        <w:rPr/>
+      </w:pPr>
+      <w:r>
+        <w:rPr/>
+      </w:r>
+    </w:p>
+    <w:p>
+      <w:pPr>
+        <w:pStyle w:val="BodyText"/>
+        <w:rPr/>
+      </w:pPr>
+      <w:r>
+        <w:rPr/>
+        <w:t>4.1 Instruction: You are a CTI expert that gives precise and concise answers. Question: Which MITRE ATT&amp;CK technique is most directly associated with the attack pattern {cap:CAPEC.name}? Answer: Based on the structural relationship between frameworks, {cap.name} is mapped to the ATT&amp;CK technique {ap:cap.map_ap.name} ({ap.id}). This technique involves the following: {ap.description}</w:t>
+      </w:r>
+    </w:p>
+    <w:p>
+      <w:pPr>
+        <w:pStyle w:val="BodyText"/>
+        <w:rPr/>
+      </w:pPr>
+      <w:r>
+        <w:rPr/>
+        <w:t>Schema: capec:CAPEC - map_ap - attack-pattern</w:t>
+      </w:r>
+    </w:p>
+    <w:p>
+      <w:pPr>
+        <w:pStyle w:val="BodyText"/>
+        <w:rPr/>
+      </w:pPr>
+      <w:r>
+        <w:rPr/>
+      </w:r>
+    </w:p>
+    <w:p>
+      <w:pPr>
+        <w:pStyle w:val="BodyText"/>
+        <w:rPr/>
+      </w:pPr>
+      <w:r>
+        <w:rPr/>
+        <w:t>4.3 Instruction: You are a CTI expert that gives precise and concise answers. Question: How does an adversary use {ap:attack-pattern.name} (ID {ap.id}) to achieve persistence on {ap.x_mitre_platforms} systems? Answer: Adversaries implement {ap.name} by doing the following: {ap.description[_~"achieve persistence"</w:t>
+      </w:r>
+      <w:r>
+        <w:rPr/>
         <w:t>]</w:t>
       </w:r>
       <w:r>
         <w:rPr/>
-        <w:t>}.</w:t>
-      </w:r>
-    </w:p>
-    <w:p>
-      <w:pPr>
-        <w:pStyle w:val="BodyText"/>
-        <w:rPr/>
-      </w:pPr>
-      <w:r>
-        <w:rPr/>
-        <w:t>Summary</w:t>
-      </w:r>
-      <w:r>
-        <w:rPr/>
-        <w:t>: {dc.detects|description}</w:t>
-      </w:r>
-    </w:p>
-    <w:p>
-      <w:pPr>
-        <w:pStyle w:val="BodyText"/>
-        <w:rPr/>
-      </w:pPr>
-      <w:r>
-        <w:rPr/>
-        <w:t>Schema: x-mitre-data-component - detects - attack-pattern</w:t>
-      </w:r>
-    </w:p>
-    <w:p>
-      <w:pPr>
-        <w:pStyle w:val="BodyText"/>
-        <w:rPr/>
-      </w:pPr>
-      <w:r>
-        <w:rPr/>
-      </w:r>
-    </w:p>
-    <w:p>
-      <w:pPr>
-        <w:pStyle w:val="BodyText"/>
-        <w:rPr/>
-      </w:pPr>
-      <w:r>
-        <w:rPr/>
-        <w:t>3.4 Instruction: You are a CTI expert that gives precise and concise answers. Question: How does the malware {m:malware.name} (ID {m.id}) implement the technique {ap:m.uses.name} during its operations? Answer: {m.name} utilizes technique {ap.name} as follows: {ap.description} This is often seen on {m.x_mitre_platforms} platforms.</w:t>
-      </w:r>
-    </w:p>
-    <w:p>
-      <w:pPr>
-        <w:pStyle w:val="BodyText"/>
-        <w:rPr/>
-      </w:pPr>
-      <w:r>
-        <w:rPr/>
-        <w:t>Summary: {m.uses|description}</w:t>
-      </w:r>
-    </w:p>
-    <w:p>
-      <w:pPr>
-        <w:pStyle w:val="BodyText"/>
-        <w:rPr/>
-      </w:pPr>
-      <w:r>
-        <w:rPr/>
-        <w:t>Schema: malware - uses - attack-pattern</w:t>
-      </w:r>
-    </w:p>
-    <w:p>
-      <w:pPr>
-        <w:pStyle w:val="BodyText"/>
-        <w:rPr/>
-      </w:pPr>
-      <w:r>
-        <w:rPr/>
-      </w:r>
-    </w:p>
-    <w:p>
-      <w:pPr>
-        <w:pStyle w:val="BodyText"/>
-        <w:rPr/>
-      </w:pPr>
-      <w:r>
-        <w:rPr/>
-        <w:t xml:space="preserve">3.6 Instruction: You are a CTI expert that gives precise and concise answers. Question: Explain the characteristics of {ap:attack-pattern.name} (id {ap.id}) </w:t>
-      </w:r>
-      <w:commentRangeStart w:id="6"/>
-      <w:r>
-        <w:rPr>
-          <w:shd w:fill="FFFF00" w:val="clear"/>
-        </w:rPr>
-        <w:t>specifically regarding how it handles data encryption or protocol blending</w:t>
-      </w:r>
-      <w:r>
-        <w:rPr>
-          <w:shd w:fill="FFFF00" w:val="clear"/>
-        </w:rPr>
-      </w:r>
-      <w:commentRangeEnd w:id="6"/>
-      <w:r>
-        <w:commentReference w:id="6"/>
-      </w:r>
-      <w:r>
-        <w:rPr/>
-        <w:t>. Answer: {ap.name} involves  these steps: {ap.description} Detection often relies on this method: {ap.x_mitre_detection}.</w:t>
-      </w:r>
-    </w:p>
-    <w:p>
-      <w:pPr>
-        <w:pStyle w:val="BodyText"/>
-        <w:rPr/>
-      </w:pPr>
-      <w:r>
-        <w:rPr/>
-      </w:r>
-    </w:p>
-    <w:p>
-      <w:pPr>
-        <w:pStyle w:val="BodyText"/>
-        <w:rPr/>
-      </w:pPr>
-      <w:commentRangeStart w:id="7"/>
-      <w:r>
-        <w:rPr/>
-        <w:t>3.6 Instruction</w:t>
-      </w:r>
-      <w:r>
-        <w:rPr/>
-      </w:r>
-      <w:commentRangeEnd w:id="7"/>
-      <w:r>
-        <w:commentReference w:id="7"/>
-      </w:r>
-      <w:r>
-        <w:rPr/>
-        <w:t>: You are a CTI expert that gives precise and concise answers. Question: Explain the characteristics of {ap:attack-pattern.name} (id {ap.id}. Answer: {ap.name} involves {ap.description} Detection often relies on {ap.x_mitre_detection}</w:t>
-      </w:r>
-    </w:p>
-    <w:p>
-      <w:pPr>
-        <w:pStyle w:val="BodyText"/>
-        <w:rPr/>
-      </w:pPr>
-      <w:r>
-        <w:rPr/>
-      </w:r>
-    </w:p>
-    <w:p>
-      <w:pPr>
-        <w:pStyle w:val="BodyText"/>
-        <w:rPr/>
-      </w:pPr>
-      <w:r>
-        <w:rPr/>
-        <w:t>3.7 Instruction: You are a CTI expert that gives precise and concise answers. Question: To which MITRE ATT&amp;CK tactic does the technique {ap:attack-pattern.name} (ID {ap.id}) belong, and what is the adversary's primary goal in this phase? Answer: {ap.name} maps to the {tac:ap.achieve</w:t>
-      </w:r>
-      <w:r>
-        <w:rPr/>
-        <w:t>s</w:t>
-      </w:r>
-      <w:r>
-        <w:rPr/>
-        <w:t>.name} tactic. Its goal and description is {ap.description}</w:t>
-      </w:r>
-    </w:p>
-    <w:p>
-      <w:pPr>
-        <w:pStyle w:val="BodyText"/>
-        <w:rPr/>
-      </w:pPr>
-      <w:r>
-        <w:rPr/>
-        <w:t>Schema: attack-pattern - achieves - x-mitre-tactic</w:t>
-      </w:r>
-    </w:p>
-    <w:p>
-      <w:pPr>
-        <w:pStyle w:val="BodyText"/>
-        <w:rPr/>
-      </w:pPr>
-      <w:r>
-        <w:rPr/>
-      </w:r>
-    </w:p>
-    <w:p>
-      <w:pPr>
-        <w:pStyle w:val="BodyText"/>
-        <w:rPr/>
-      </w:pPr>
-      <w:commentRangeStart w:id="8"/>
-      <w:r>
-        <w:rPr/>
-        <w:t xml:space="preserve">3.8 Instruction: </w:t>
-      </w:r>
-      <w:r>
-        <w:rPr/>
-      </w:r>
-      <w:commentRangeEnd w:id="8"/>
-      <w:r>
-        <w:commentReference w:id="8"/>
-      </w:r>
-      <w:r>
-        <w:rPr/>
-        <w:t>You are a CTI expert that gives precise and concise answers. Question: Which mechanisms are leveraged by {tl:tool.name} (ID {tl.id}) whan used for technique {ap:tl.uses.name}? Answer: The tool {tl.name} is used to execute attack pattern {ap.name} (ID {ap.id}), that generally targets these platforms: {ap.x_mitre_platforms}. The technique proceeds as follows: {ap.description}.</w:t>
-      </w:r>
-    </w:p>
-    <w:p>
-      <w:pPr>
-        <w:pStyle w:val="BodyText"/>
-        <w:rPr/>
-      </w:pPr>
-      <w:r>
-        <w:rPr/>
-        <w:t>Summary: {tl.uses|description}</w:t>
-      </w:r>
-    </w:p>
-    <w:p>
-      <w:pPr>
-        <w:pStyle w:val="BodyText"/>
-        <w:rPr/>
-      </w:pPr>
-      <w:r>
-        <w:rPr/>
-        <w:t>Schema: tool - uses - attack-pattern</w:t>
-      </w:r>
-    </w:p>
-    <w:p>
-      <w:pPr>
-        <w:pStyle w:val="BodyText"/>
-        <w:rPr/>
-      </w:pPr>
-      <w:r>
-        <w:rPr/>
-      </w:r>
-    </w:p>
-    <w:p>
-      <w:pPr>
-        <w:pStyle w:val="BodyText"/>
-        <w:rPr/>
-      </w:pPr>
-      <w:r>
-        <w:rPr/>
-        <w:t>3.9 Instruction: You are a CTI expert that gives precise and concise answers. Question: Give a technique that uses methods to evade detection. Answer: Attack pattern {ap:attack-pattern.name} (id {ap.id}) uses methods to evade detection, as described below: {ap.description[_^"evade detection"]}. Analysts should look for {ap.x_mitre_detection}.</w:t>
-      </w:r>
-    </w:p>
-    <w:p>
-      <w:pPr>
-        <w:pStyle w:val="BodyText"/>
-        <w:rPr/>
-      </w:pPr>
-      <w:r>
-        <w:rPr/>
-      </w:r>
-    </w:p>
-    <w:p>
-      <w:pPr>
-        <w:pStyle w:val="BodyText"/>
-        <w:rPr/>
-      </w:pPr>
-      <w:r>
-        <w:rPr/>
-        <w:t>3.9a Instruction: You are a CTI expert that gives precise and concise answers. Question: Give a technique that uses methods to bypass security controls. Answer: Attack pattern {ap:attack-pattern.name} (id {ap.id}) uses methods to evade detection, as described below: {ap.description[_^"evade detection"]}. Analysts should look for {ap.x_mitre_detection}.</w:t>
-      </w:r>
-    </w:p>
-    <w:p>
-      <w:pPr>
-        <w:pStyle w:val="BodyText"/>
-        <w:rPr/>
-      </w:pPr>
-      <w:r>
-        <w:rPr/>
-      </w:r>
-    </w:p>
-    <w:p>
-      <w:pPr>
-        <w:pStyle w:val="BodyText"/>
-        <w:rPr/>
-      </w:pPr>
-      <w:r>
-        <w:rPr/>
-        <w:t>3.10 Instruction: You are a CTI expert that gives precise and concise answers. Question: Describe the artifacts left behind when technique {ap.name} ({ap.id}) is executed on {ap.x_mitre_platforms}. Answer: On {ap.x_mitre_platforms}, the execution of {ap.name} involves the following: {ap.description} Consider the following for detection: {ap:attack-pattern.x_mitre_detection}</w:t>
-      </w:r>
-    </w:p>
-    <w:p>
-      <w:pPr>
-        <w:pStyle w:val="BodyText"/>
-        <w:rPr/>
-      </w:pPr>
-      <w:r>
-        <w:rPr/>
-      </w:r>
-    </w:p>
-    <w:p>
-      <w:pPr>
-        <w:pStyle w:val="BodyText"/>
-        <w:rPr/>
-      </w:pPr>
-      <w:r>
-        <w:rPr/>
-        <w:t>4.1 Instruction: You are a CTI expert that gives precise and concise answers. Question: Which MITRE ATT&amp;CK technique is most directly associated with the attack pattern {cap:CAPEC.name}? Answer: Based on the structural relationship between frameworks, {cap.name} is mapped to the ATT&amp;CK technique {ap:cap.map_ap.name} ({ap.id}). This technique involves the following: {ap.description}</w:t>
-      </w:r>
-    </w:p>
-    <w:p>
-      <w:pPr>
-        <w:pStyle w:val="BodyText"/>
-        <w:rPr/>
-      </w:pPr>
-      <w:r>
-        <w:rPr/>
-        <w:t>Schema: capec:CAPEC - map_ap - attack-pattern</w:t>
-      </w:r>
-    </w:p>
-    <w:p>
-      <w:pPr>
-        <w:pStyle w:val="BodyText"/>
-        <w:rPr/>
-      </w:pPr>
-      <w:r>
-        <w:rPr/>
-      </w:r>
-    </w:p>
-    <w:p>
-      <w:pPr>
-        <w:pStyle w:val="BodyText"/>
-        <w:rPr/>
-      </w:pPr>
-      <w:r>
-        <w:rPr/>
-        <w:t>4.3 Instruction: You are a CTI expert that gives precise and concise answers. Question: How does an adversary use {ap:attack-pattern.name} (ID {ap.id}) to achieve persistence on {ap.x_mitre_platforms} systems? Answer: Adversaries implement {ap.name} by doing the following: {ap.description[_^"achieve persistence"}. In corporate environments, this often involves manipulating {ap.x_mitre_platforms} components to force the loading of malicious binaries.</w:t>
-      </w:r>
-    </w:p>
-    <w:p>
-      <w:pPr>
-        <w:pStyle w:val="BodyText"/>
-        <w:rPr/>
-      </w:pPr>
-      <w:r>
-        <w:rPr/>
-      </w:r>
-    </w:p>
-    <w:p>
-      <w:pPr>
-        <w:pStyle w:val="BodyText"/>
-        <w:rPr/>
-      </w:pPr>
-      <w:r>
-        <w:rPr/>
-        <w:t>4.3a Instruction: You are a CTI expert that gives precise and concise answers. Question: How does an adversary use {ap:attack-pattern.name} (ID {ap.id}) to achieve elevated execution  on {ap.x_mitre_platforms} systems? Answer: Adversaries implement {ap.name} by doing the following: {ap.description[_^"elevated execution"}. In corporate environments, this often involves manipulating {ap.x_mitre_platforms} components to force the loading of malicious binaries.</w:t>
-      </w:r>
-    </w:p>
-    <w:p>
-      <w:pPr>
-        <w:pStyle w:val="BodyText"/>
-        <w:rPr/>
-      </w:pPr>
-      <w:r>
-        <w:rPr/>
-      </w:r>
-    </w:p>
-    <w:p>
-      <w:pPr>
-        <w:pStyle w:val="BodyText"/>
-        <w:rPr/>
-      </w:pPr>
-      <w:commentRangeStart w:id="9"/>
+        <w:t>}. In corporate environments, this often involves manipulating {ap.x_mitre_platforms} components to force the loading of malicious binaries.</w:t>
+      </w:r>
+    </w:p>
+    <w:p>
+      <w:pPr>
+        <w:pStyle w:val="BodyText"/>
+        <w:rPr/>
+      </w:pPr>
+      <w:r>
+        <w:rPr/>
+      </w:r>
+    </w:p>
+    <w:p>
+      <w:pPr>
+        <w:pStyle w:val="BodyText"/>
+        <w:rPr/>
+      </w:pPr>
+      <w:r>
+        <w:rPr/>
+        <w:t>4.3a Instruction: You are a CTI expert that gives precise and concise answers. Question: How does an adversary use {ap:attack-pattern.name} (ID {ap.id}) to achieve elevated execution  on {ap.x_mitre_platforms} systems? Answer: Adversaries implement {ap.name} by doing the following: {ap.description[_~"elevated execution"</w:t>
+      </w:r>
+      <w:r>
+        <w:rPr/>
+        <w:t>]</w:t>
+      </w:r>
+      <w:r>
+        <w:rPr/>
+        <w:t>}. In corporate environments, this often involves manipulating {ap.x_mitre_platforms} components to force the loading of malicious binaries.</w:t>
+      </w:r>
+    </w:p>
+    <w:p>
+      <w:pPr>
+        <w:pStyle w:val="BodyText"/>
+        <w:rPr/>
+      </w:pPr>
+      <w:r>
+        <w:rPr/>
+      </w:r>
+    </w:p>
+    <w:p>
+      <w:pPr>
+        <w:pStyle w:val="BodyText"/>
+        <w:rPr/>
+      </w:pPr>
+      <w:commentRangeStart w:id="11"/>
       <w:r>
         <w:rPr/>
         <w:t>4.4 Instruction</w:t>
@@ -1235,9 +1340,9 @@
       <w:r>
         <w:rPr/>
       </w:r>
-      <w:commentRangeEnd w:id="9"/>
-      <w:r>
-        <w:commentReference w:id="9"/>
+      <w:commentRangeEnd w:id="11"/>
+      <w:r>
+        <w:commentReference w:id="11"/>
       </w:r>
       <w:r>
         <w:rPr/>
@@ -1245,7 +1350,7 @@
       </w:r>
       <w:r>
         <w:rPr/>
-        <w:commentReference w:id="10"/>
+        <w:commentReference w:id="12"/>
       </w:r>
       <w:r>
         <w:rPr/>
@@ -1268,7 +1373,7 @@
         <w:pStyle w:val="BodyText"/>
         <w:rPr/>
       </w:pPr>
-      <w:commentRangeStart w:id="11"/>
+      <w:commentRangeStart w:id="13"/>
       <w:r>
         <w:rPr/>
         <w:t>4.6 Instruction</w:t>
@@ -1276,56 +1381,71 @@
       <w:r>
         <w:rPr/>
       </w:r>
-      <w:commentRangeEnd w:id="11"/>
-      <w:r>
-        <w:commentReference w:id="11"/>
-      </w:r>
-      <w:r>
-        <w:rPr/>
-        <w:t xml:space="preserve">: You are a CTI expert that gives precise and concise answers. Question: Which specific data component and monitoring approach </w:t>
-      </w:r>
-      <w:r>
-        <w:rPr/>
-        <w:t>are</w:t>
-      </w:r>
-      <w:r>
-        <w:rPr/>
-        <w:t xml:space="preserve"> effective for detecting {ap:attack-pattern.name}? Answer: Detection of {ap.name} (ID {ap.id}) is achieved by monitoring data sources {ap.x_mitre_data_sources}. In particular, data component {dc:ap.</w:t>
-      </w:r>
-      <w:r>
-        <w:rPr/>
-        <w:t>detects&lt;</w:t>
-      </w:r>
-      <w:r>
-        <w:rPr/>
-        <w:t>.name} belongs to data source {dc.belongs_to.name} and it is described by {dc.description}. Detection logic for technique {ap.name} should focus on: {ap.x_mitre_detection}</w:t>
-      </w:r>
-    </w:p>
-    <w:p>
-      <w:pPr>
-        <w:pStyle w:val="BodyText"/>
-        <w:rPr/>
-      </w:pPr>
-      <w:r>
-        <w:rPr/>
-        <w:t>Schema: x-mitre-data-component - detects - attack-pattern, x-mitre-data-component - belongs_to - x-mitre-data-source</w:t>
-      </w:r>
-    </w:p>
-    <w:p>
-      <w:pPr>
-        <w:pStyle w:val="BodyText"/>
-        <w:rPr/>
-      </w:pPr>
-      <w:r>
-        <w:rPr/>
-      </w:r>
-    </w:p>
-    <w:p>
-      <w:pPr>
-        <w:pStyle w:val="BodyText"/>
-        <w:rPr/>
-      </w:pPr>
-      <w:commentRangeStart w:id="12"/>
+      <w:commentRangeEnd w:id="13"/>
+      <w:r>
+        <w:commentReference w:id="13"/>
+      </w:r>
+      <w:r>
+        <w:rPr/>
+        <w:t>: You are a CTI expert that gives precise and concise answers. Question: Which specific data component and monitoring approach are effective for detecting {ap:attack-pattern.name}? Answer: To detect this technique, you should monitor data component {dc.</w:t>
+      </w:r>
+      <w:r>
+        <w:rPr/>
+        <w:t>name</w:t>
+      </w:r>
+      <w:r>
+        <w:rPr/>
+        <w:t xml:space="preserve">}. </w:t>
+      </w:r>
+      <w:r>
+        <w:rPr/>
+        <w:t xml:space="preserve">This is because technique {ap.name} is detected with detection strategy {det:ap.detects&lt;name} (det.id), specifically, with analytic {an:det.implemented_by.name} on platforms {an.platforms}, which requires data component (log source) {dc:an.requires_data.name}.  </w:t>
+      </w:r>
+    </w:p>
+    <w:p>
+      <w:pPr>
+        <w:pStyle w:val="BodyText"/>
+        <w:rPr/>
+      </w:pPr>
+      <w:r>
+        <w:rPr/>
+        <w:t>Schema: x-mitre-detection-strategy - detects - attack-pattern, x-mitre-analytic - requires_data - x-mitre-data-component, x-mitre-detection-strategy -  implemented_by - x-mitre-analytic</w:t>
+      </w:r>
+    </w:p>
+    <w:p>
+      <w:pPr>
+        <w:pStyle w:val="BodyText"/>
+        <w:rPr/>
+      </w:pPr>
+      <w:r>
+        <w:rPr/>
+        <w:t>=============</w:t>
+      </w:r>
+    </w:p>
+    <w:p>
+      <w:pPr>
+        <w:pStyle w:val="BodyText"/>
+        <w:rPr/>
+      </w:pPr>
+      <w:r>
+        <w:rPr/>
+      </w:r>
+    </w:p>
+    <w:p>
+      <w:pPr>
+        <w:pStyle w:val="BodyText"/>
+        <w:rPr/>
+      </w:pPr>
+      <w:r>
+        <w:rPr/>
+      </w:r>
+    </w:p>
+    <w:p>
+      <w:pPr>
+        <w:pStyle w:val="BodyText"/>
+        <w:rPr/>
+      </w:pPr>
+      <w:commentRangeStart w:id="14"/>
       <w:r>
         <w:rPr/>
         <w:t>4.7 Instruction:</w:t>
@@ -1333,23 +1453,15 @@
       <w:r>
         <w:rPr/>
       </w:r>
-      <w:commentRangeEnd w:id="12"/>
-      <w:r>
-        <w:commentReference w:id="12"/>
-      </w:r>
-      <w:r>
-        <w:rPr/>
-        <w:t xml:space="preserve"> You are a CTI expert that gives precise and concise answers. Question: Within the {ta:</w:t>
-      </w:r>
-      <w:r>
-        <w:rPr/>
-        <w:t>ap.achieves</w:t>
-      </w:r>
-      <w:r>
-        <w:rPr/>
-        <w:t>.name} tactic, which technique does the following actions:</w:t>
-      </w:r>
-      <w:commentRangeStart w:id="13"/>
+      <w:commentRangeEnd w:id="14"/>
+      <w:r>
+        <w:commentReference w:id="14"/>
+      </w:r>
+      <w:r>
+        <w:rPr/>
+        <w:t xml:space="preserve"> You are a CTI expert that gives precise and concise answers. Question: Within the {ta:ap.achieves.name} tactic, which technique does the following actions:</w:t>
+      </w:r>
+      <w:commentRangeStart w:id="15"/>
       <w:r>
         <w:rPr/>
         <w:t xml:space="preserve"> &lt;desc&gt;</w:t>
@@ -1357,21 +1469,13 @@
       <w:r>
         <w:rPr/>
       </w:r>
-      <w:commentRangeEnd w:id="13"/>
-      <w:r>
-        <w:commentReference w:id="13"/>
-      </w:r>
-      <w:r>
-        <w:rPr/>
-        <w:t>: {</w:t>
-      </w:r>
-      <w:r>
-        <w:rPr/>
-        <w:t>ap:attack-pattern.</w:t>
-      </w:r>
-      <w:r>
-        <w:rPr/>
-        <w:t xml:space="preserve">description}&lt;/desc&gt;? Answer: Technique {ap.name} (ID {ap.id}) is used during the {ta.name} phase, on {ap.x_mitre_platforms} platform(s). </w:t>
+      <w:commentRangeEnd w:id="15"/>
+      <w:r>
+        <w:commentReference w:id="15"/>
+      </w:r>
+      <w:r>
+        <w:rPr/>
+        <w:t xml:space="preserve">: {ap:attack-pattern.description}&lt;/desc&gt;? Answer: Technique {ap.name} (ID {ap.id}) is used during the {ta.name} phase, on {ap.x_mitre_platforms} platform(s). </w:t>
       </w:r>
     </w:p>
     <w:p>
@@ -1398,7 +1502,7 @@
         <w:pStyle w:val="BodyText"/>
         <w:rPr/>
       </w:pPr>
-      <w:commentRangeStart w:id="14"/>
+      <w:commentRangeStart w:id="16"/>
       <w:r>
         <w:rPr/>
         <w:t>4.8 Instruction</w:t>
@@ -1406,13 +1510,13 @@
       <w:r>
         <w:rPr/>
       </w:r>
-      <w:commentRangeEnd w:id="14"/>
-      <w:r>
-        <w:commentReference w:id="14"/>
-      </w:r>
-      <w:r>
-        <w:rPr/>
-        <w:t>: You are a CTI expert that gives precise and concise answers. Question: How does the ATT&amp;CK technique {ap:attack-pattern.name} relate to hardware security ? Answer: Technique {ap.name} (ID {ap.id}) involves the following: {ap.description[_^"</w:t>
+      <w:commentRangeEnd w:id="16"/>
+      <w:r>
+        <w:commentReference w:id="16"/>
+      </w:r>
+      <w:r>
+        <w:rPr/>
+        <w:t>: You are a CTI expert that gives precise and concise answers. Question: How does the ATT&amp;CK technique {ap:attack-pattern.name} relate to hardware security ? Answer: Technique {ap.name} (ID {ap.id}) involves the following: {ap.description[_~"</w:t>
       </w:r>
       <w:r>
         <w:rPr>
@@ -1423,7 +1527,15 @@
       </w:r>
       <w:r>
         <w:rPr/>
-        <w:t>security"}. This is mitigated by course of action {coa:ap.</w:t>
+        <w:t>security"</w:t>
+      </w:r>
+      <w:r>
+        <w:rPr/>
+        <w:t>]</w:t>
+      </w:r>
+      <w:r>
+        <w:rPr/>
+        <w:t>}. This is mitigated by course of action {coa:ap.</w:t>
       </w:r>
       <w:r>
         <w:rPr>
@@ -1492,7 +1604,7 @@
         <w:pStyle w:val="BodyText"/>
         <w:rPr/>
       </w:pPr>
-      <w:commentRangeStart w:id="15"/>
+      <w:commentRangeStart w:id="17"/>
       <w:r>
         <w:rPr/>
         <w:t>4.8a Instruction</w:t>
@@ -1500,13 +1612,21 @@
       <w:r>
         <w:rPr/>
       </w:r>
-      <w:commentRangeEnd w:id="15"/>
-      <w:r>
-        <w:commentReference w:id="15"/>
-      </w:r>
-      <w:r>
-        <w:rPr/>
-        <w:t>: You are a CTI expert that gives precise and concise answers. Question: How does the ATT&amp;CK technique {ap:attack-pattern.name} relate to supply chain compromise? Answer: Technique {ap.name} (ID {ap.id}) involves the following: {ap.description[_^"supply chain compromise"}. This is mitigated by course of action {coa:ap.</w:t>
+      <w:commentRangeEnd w:id="17"/>
+      <w:r>
+        <w:commentReference w:id="17"/>
+      </w:r>
+      <w:r>
+        <w:rPr/>
+        <w:t>: You are a CTI expert that gives precise and concise answers. Question: How does the ATT&amp;CK technique {ap:attack-pattern.name} relate to supply chain compromise? Answer: Technique {ap.name} (ID {ap.id}) involves the following: {ap.description[_~"supply chain compromise"</w:t>
+      </w:r>
+      <w:r>
+        <w:rPr/>
+        <w:t>]</w:t>
+      </w:r>
+      <w:r>
+        <w:rPr/>
+        <w:t>}. This is mitigated by course of action {coa:ap.</w:t>
       </w:r>
       <w:r>
         <w:rPr>
@@ -1634,7 +1754,7 @@
         <w:pStyle w:val="BodyText"/>
         <w:rPr/>
       </w:pPr>
-      <w:commentRangeStart w:id="16"/>
+      <w:commentRangeStart w:id="18"/>
       <w:r>
         <w:rPr/>
         <w:t xml:space="preserve">2.5 Instruction: </w:t>
@@ -1642,21 +1762,13 @@
       <w:r>
         <w:rPr/>
       </w:r>
-      <w:commentRangeEnd w:id="16"/>
-      <w:r>
-        <w:commentReference w:id="16"/>
-      </w:r>
-      <w:r>
-        <w:rPr/>
-        <w:t>You are a CTI expert that gives precise and concise answers. Question: What attack pattern is commonly associated with the threat group {is:intrusion-set.name} (ID {is.id})? Answer: The group {is.name} is known to use attack pattern {</w:t>
-      </w:r>
-      <w:r>
-        <w:rPr/>
-        <w:t>ap:</w:t>
-      </w:r>
-      <w:r>
-        <w:rPr/>
-        <w:t>is.uses&gt;attack-pattern.name} (ID {ap.id}). Procedure detail: {ap.description}</w:t>
+      <w:commentRangeEnd w:id="18"/>
+      <w:r>
+        <w:commentReference w:id="18"/>
+      </w:r>
+      <w:r>
+        <w:rPr/>
+        <w:t>You are a CTI expert that gives precise and concise answers. Question: What attack pattern is commonly associated with the threat group {is:intrusion-set.name} (ID {is.id})? Answer: The group {is.name} is known to use attack pattern {ap:is.uses&gt;attack-pattern.name} (ID {ap.id}). Procedure detail: {ap.description}</w:t>
       </w:r>
     </w:p>
     <w:p>
@@ -1734,17 +1846,17 @@
       </w:pPr>
       <w:r>
         <w:rPr/>
-        <w:t>3.5 Instruction: You are a CTI expert that gives precise and concise answers. Question: Which technique is used by the threat group {is:intrusion-set.name} (ID {is.id}), known for using it during its campaigns, such as its method for initial access? Answer: Intrusion set {is.name} is known to use attack pattern {ap:is.uses&lt;attack-pattern.name} (ID {ap.id}). According to CTI reports: {ap.description[_^"initial access"]}.</w:t>
-      </w:r>
-    </w:p>
-    <w:p>
-      <w:pPr>
-        <w:pStyle w:val="BodyText"/>
-        <w:rPr/>
-      </w:pPr>
-      <w:r>
-        <w:rPr/>
-        <w:t>Summary: {ap:is.uses&lt;attack-pattern|description}</w:t>
+        <w:t>3.5 Instruction: You are a CTI expert that gives precise and concise answers. Question: Which technique is used by the threat group {is:intrusion-set.name} (ID {is.id}), known for using it during its campaigns, such as its method for initial access? Answer: Intrusion set {is.name} is known to use attack pattern {ap:is.uses&gt;attack-pattern.name} (ID {ap.id}). According to CTI reports: {ap.description[_~"initial access"]}.</w:t>
+      </w:r>
+    </w:p>
+    <w:p>
+      <w:pPr>
+        <w:pStyle w:val="BodyText"/>
+        <w:rPr/>
+      </w:pPr>
+      <w:r>
+        <w:rPr/>
+        <w:t>Summary: {ap:is.uses&gt;attack-pattern|description}</w:t>
       </w:r>
     </w:p>
     <w:p>
@@ -1773,17 +1885,17 @@
       </w:pPr>
       <w:r>
         <w:rPr/>
-        <w:t>3.5a Instruction: You are a CTI expert that gives precise and concise answers. Question: Which technique is used by the threat group {is:intrusion-set.name} (ID {is.id}), known for using it during its campaigns, such as its method for infrastructure acquisition? Answer: Intrusion set {is.name} is known to use attack pattern {ap:is.uses&lt;attack-pattern.name} (ID {ap.id}). According to CTI reports: {ap.description[_^"infrastructure acquisition"]}.</w:t>
-      </w:r>
-    </w:p>
-    <w:p>
-      <w:pPr>
-        <w:pStyle w:val="BodyText"/>
-        <w:rPr/>
-      </w:pPr>
-      <w:r>
-        <w:rPr/>
-        <w:t>Summary: {ap:is.uses&lt;attack-pattern|description}</w:t>
+        <w:t>3.5a Instruction: You are a CTI expert that gives precise and concise answers. Question: Which technique is used by the threat group {is:intrusion-set.name} (ID {is.id}), known for using it during its campaigns, such as its method for infrastructure acquisition? Answer: Intrusion set {is.name} is known to use attack pattern {ap:is.uses&gt;attack-pattern.name} (ID {ap.id}). According to CTI reports: {ap.description[_~"infrastructure acquisition"]}.</w:t>
+      </w:r>
+    </w:p>
+    <w:p>
+      <w:pPr>
+        <w:pStyle w:val="BodyText"/>
+        <w:rPr/>
+      </w:pPr>
+      <w:r>
+        <w:rPr/>
+        <w:t>Summary: {ap:is.uses&gt;attack-pattern|description}</w:t>
       </w:r>
     </w:p>
     <w:p>
@@ -1842,7 +1954,7 @@
           <w:shd w:fill="DDDDDD" w:val="clear"/>
         </w:rPr>
       </w:pPr>
-      <w:commentRangeStart w:id="17"/>
+      <w:commentRangeStart w:id="19"/>
       <w:r>
         <w:rPr>
           <w:shd w:fill="DDDDDD" w:val="clear"/>
@@ -1854,9 +1966,9 @@
           <w:shd w:fill="DDDDDD" w:val="clear"/>
         </w:rPr>
       </w:r>
-      <w:commentRangeEnd w:id="17"/>
-      <w:r>
-        <w:commentReference w:id="17"/>
+      <w:commentRangeEnd w:id="19"/>
+      <w:r>
+        <w:commentReference w:id="19"/>
       </w:r>
       <w:r>
         <w:rPr>
@@ -1920,7 +2032,7 @@
           <w:shd w:fill="DDDDDD" w:val="clear"/>
         </w:rPr>
       </w:pPr>
-      <w:commentRangeStart w:id="18"/>
+      <w:commentRangeStart w:id="20"/>
       <w:r>
         <w:rPr>
           <w:shd w:fill="DDDDDD" w:val="clear"/>
@@ -1932,9 +2044,9 @@
           <w:shd w:fill="DDDDDD" w:val="clear"/>
         </w:rPr>
       </w:r>
-      <w:commentRangeEnd w:id="18"/>
-      <w:r>
-        <w:commentReference w:id="18"/>
+      <w:commentRangeEnd w:id="20"/>
+      <w:r>
+        <w:commentReference w:id="20"/>
       </w:r>
       <w:r>
         <w:rPr>
@@ -1974,7 +2086,7 @@
         <w:pStyle w:val="BodyText"/>
         <w:rPr/>
       </w:pPr>
-      <w:commentRangeStart w:id="19"/>
+      <w:commentRangeStart w:id="21"/>
       <w:r>
         <w:rPr>
           <w:shd w:fill="DDDDDD" w:val="clear"/>
@@ -1986,9 +2098,9 @@
           <w:shd w:fill="DDDDDD" w:val="clear"/>
         </w:rPr>
       </w:r>
-      <w:commentRangeEnd w:id="19"/>
-      <w:r>
-        <w:commentReference w:id="19"/>
+      <w:commentRangeEnd w:id="21"/>
+      <w:r>
+        <w:commentReference w:id="21"/>
       </w:r>
       <w:r>
         <w:rPr>
@@ -2121,7 +2233,7 @@
         <w:rPr/>
         <w:t xml:space="preserve">A.5 Instruction: You are a cybersecurity expert that has been trained to give precise responses to complex cybersecurity questions. You work in a SOC protecting data for enterprise customers helping to protect their digital assets. Question: Provide real-world examples of {cap:CAPEC.name} (CAPEC-{cap.id}) in action. Answer: Examples: </w:t>
       </w:r>
-      <w:commentRangeStart w:id="20"/>
+      <w:commentRangeStart w:id="22"/>
       <w:r>
         <w:rPr/>
         <w:t>{cap.example_instances}</w:t>
@@ -2129,15 +2241,15 @@
       <w:r>
         <w:rPr/>
       </w:r>
-      <w:commentRangeEnd w:id="20"/>
-      <w:r>
-        <w:commentReference w:id="20"/>
+      <w:commentRangeEnd w:id="22"/>
+      <w:r>
+        <w:commentReference w:id="22"/>
       </w:r>
       <w:r>
         <w:rPr/>
         <w:t xml:space="preserve">. These cases align with the execution flow  &lt;desc&gt;{cap.execution_flow}&lt;/desc&gt;. This pattern exploits CWE </w:t>
       </w:r>
-      <w:commentRangeStart w:id="21"/>
+      <w:commentRangeStart w:id="23"/>
       <w:r>
         <w:rPr/>
         <w:t xml:space="preserve">{cwe:cap.weakness.name} (ID {cwe:id}). </w:t>
@@ -2145,9 +2257,9 @@
       <w:r>
         <w:rPr/>
       </w:r>
-      <w:commentRangeEnd w:id="21"/>
-      <w:r>
-        <w:commentReference w:id="21"/>
+      <w:commentRangeEnd w:id="23"/>
+      <w:r>
+        <w:commentReference w:id="23"/>
       </w:r>
       <w:r>
         <w:rPr/>
@@ -2268,23 +2380,45 @@
       </w:pPr>
       <w:r>
         <w:rPr/>
-        <w:t xml:space="preserve">S.1 Instruction: You are a cybersecurity expert that has been trained to give precise responses to complex cybersecurity questions. You work in a SOC protecting data for enterprise customers helping to protect their digital assets. Question: Assess remediation urgency for </w:t>
-      </w:r>
-      <w:r>
-        <w:rPr/>
-        <w:t xml:space="preserve">KEV </w:t>
-      </w:r>
-      <w:r>
-        <w:rPr/>
-        <w:t>{k</w:t>
-      </w:r>
-      <w:r>
-        <w:rPr/>
-        <w:t>ev</w:t>
-      </w:r>
-      <w:r>
-        <w:rPr/>
-        <w:t>:KE</w:t>
+        <w:t xml:space="preserve">S.1 Instruction: You are a cybersecurity expert that has been trained to give precise responses to complex cybersecurity questions. You work in a SOC protecting data for enterprise customers helping to protect their digital assets. Question: Assess remediation urgency for KEV {kev:KEV.vulnerabilityName} in {kev.product}. Answer: KEV {kev.vulnerabilityName}) maps to CVE {kev.cveID} and it is actively exploited in {kev.product} (vendor project {kev.vendorProject}). Recommended action: {kev.requiredAction}. </w:t>
+      </w:r>
+    </w:p>
+    <w:p>
+      <w:pPr>
+        <w:pStyle w:val="BodyText"/>
+        <w:rPr/>
+      </w:pPr>
+      <w:r>
+        <w:rPr/>
+      </w:r>
+    </w:p>
+    <w:p>
+      <w:pPr>
+        <w:pStyle w:val="BodyText"/>
+        <w:rPr/>
+      </w:pPr>
+      <w:r>
+        <w:rPr/>
+        <w:t xml:space="preserve">S.2 Instruction: You are a cybersecurity expert that has been trained to give precise responses to complex cybersecurity questions. You work in a SOC protecting data for enterprise customers helping to protect their digital assets. Question: Explain the significance of the due date for KEV {kev:KEV.cveID}, {kev.vulnerabilityName}. Answer: Patching for {kev.cveID} ({kev.vulnerabilityName}) is due by {kev.dueDate}. Meeting this deadline ensures compliance with BOD 22-01 and reduces exposure to active exploitation. </w:t>
+      </w:r>
+    </w:p>
+    <w:p>
+      <w:pPr>
+        <w:pStyle w:val="BodyText"/>
+        <w:rPr/>
+      </w:pPr>
+      <w:r>
+        <w:rPr/>
+      </w:r>
+    </w:p>
+    <w:p>
+      <w:pPr>
+        <w:pStyle w:val="BodyText"/>
+        <w:rPr/>
+      </w:pPr>
+      <w:r>
+        <w:rPr/>
+        <w:t>S.3 Instruction: You are a cybersecurity expert that has been trained to give precise responses to complex cybersecurity questions. You work in a SOC protecting data for enterprise customers helping to protect their digital assets. Question: Identify if KEV{kev:KE</w:t>
       </w:r>
       <w:r>
         <w:rPr/>
@@ -2292,7 +2426,72 @@
       </w:r>
       <w:r>
         <w:rPr/>
-        <w:t>.vulnerabilityName} in {</w:t>
+        <w:t xml:space="preserve">.vulnerabilityName} in {kev.product} is associated with ransomware activity. Answer: KEV {kev.vulnerabilityName} maps to CVE {kev.cveID} in product {kev.product} and it has {kev.knownRansomwareCampaignUse} ransomware association. Immediate patching is recommended for higher risk. </w:t>
+      </w:r>
+    </w:p>
+    <w:p>
+      <w:pPr>
+        <w:pStyle w:val="BodyText"/>
+        <w:rPr/>
+      </w:pPr>
+      <w:r>
+        <w:rPr/>
+      </w:r>
+    </w:p>
+    <w:p>
+      <w:pPr>
+        <w:pStyle w:val="BodyText"/>
+        <w:rPr/>
+      </w:pPr>
+      <w:r>
+        <w:rPr/>
+        <w:t xml:space="preserve">S.4 Instruction: You are a cybersecurity expert that has been trained to give precise responses to complex cybersecurity questions. You work in a SOC protecting data for enterprise customers helping to protect their digital assets. Question: Summarize the technical impact and mitigation for KEV {kev:KEV.vulnerabilityName} in product {kev.product}. Answer: KEV {kev.vulnerabilityName} maps to CVE {kev.cveID} and it causes: {kev.shortDescription}. Mitigation: {kev.requiredAction}. Listed in KEV - patch immediately. </w:t>
+      </w:r>
+    </w:p>
+    <w:p>
+      <w:pPr>
+        <w:pStyle w:val="BodyText"/>
+        <w:rPr/>
+      </w:pPr>
+      <w:r>
+        <w:rPr/>
+      </w:r>
+    </w:p>
+    <w:p>
+      <w:pPr>
+        <w:pStyle w:val="BodyText"/>
+        <w:rPr/>
+      </w:pPr>
+      <w:r>
+        <w:rPr/>
+        <w:t xml:space="preserve">S.5 Instruction: You are a cybersecurity expert that has been trained to give precise responses to complex cybersecurity questions. You work in a SOC protecting data for enterprise customers helping to protect their digital assets. Question: Generate a detailed patching advisory for KEV {kev:KEV.vulnerabilityName} in product {kev.product} from {kev.vendorProject}. Answer: Vulnerability {kev.vulnerabilityName} maps to CVE  {kev.cveID} and it is explied in {kev.product} (vendor {kev.vendorProject}) is actively exploited. Detailed advisory: {kev.shortDescription}. Recommended action: {kev.requiredAction} before {kev.dueDate}. </w:t>
+      </w:r>
+    </w:p>
+    <w:p>
+      <w:pPr>
+        <w:pStyle w:val="BodyText"/>
+        <w:rPr/>
+      </w:pPr>
+      <w:r>
+        <w:rPr/>
+      </w:r>
+    </w:p>
+    <w:p>
+      <w:pPr>
+        <w:pStyle w:val="BodyText"/>
+        <w:rPr/>
+      </w:pPr>
+      <w:r>
+        <w:rPr/>
+        <w:t>S.6 Instruction: You are a cybersecurity expert that has been trained to give precise responses to complex cybersecurity questions. You work in a SOC protecting data for enterprise customers helping to protect their digital assets. Question: Provide a technical summary for KEV {kev:KEV.vulnerabilityName} (CVE {kev.cveID}) in {ke</w:t>
+      </w:r>
+      <w:r>
+        <w:rPr/>
+        <w:t>v.</w:t>
+      </w:r>
+      <w:r>
+        <w:rPr/>
+        <w:t>.product} from {kev.vendorProject}, including its weakness type. Answer: KEV {</w:t>
       </w:r>
       <w:r>
         <w:rPr/>
@@ -2300,623 +2499,24 @@
       </w:r>
       <w:r>
         <w:rPr/>
-        <w:t xml:space="preserve">.product}. Answer: </w:t>
-      </w:r>
-      <w:r>
-        <w:rPr/>
-        <w:t xml:space="preserve">KEV </w:t>
-      </w:r>
-      <w:r>
-        <w:rPr/>
-        <w:t>{k</w:t>
-      </w:r>
-      <w:r>
-        <w:rPr/>
-        <w:t>ev</w:t>
-      </w:r>
-      <w:r>
-        <w:rPr/>
-        <w:t xml:space="preserve">.vulnerabilityName}) </w:t>
-      </w:r>
-      <w:r>
-        <w:rPr/>
-        <w:t xml:space="preserve">maps to CVE {kev.cveID} and it is actively exploited </w:t>
-      </w:r>
-      <w:r>
-        <w:rPr/>
-        <w:t>in {k</w:t>
-      </w:r>
-      <w:r>
-        <w:rPr/>
-        <w:t>ev</w:t>
-      </w:r>
-      <w:r>
-        <w:rPr/>
-        <w:t>.product} (</w:t>
-      </w:r>
-      <w:r>
-        <w:rPr/>
-        <w:t xml:space="preserve">vendor project </w:t>
-      </w:r>
-      <w:r>
-        <w:rPr/>
-        <w:t>{</w:t>
-      </w:r>
-      <w:r>
-        <w:rPr/>
-        <w:t>kev</w:t>
-      </w:r>
-      <w:r>
-        <w:rPr/>
-        <w:t>.vendorProject}). Recommended action: {</w:t>
-      </w:r>
-      <w:r>
-        <w:rPr/>
-        <w:t>kev</w:t>
-      </w:r>
-      <w:r>
-        <w:rPr/>
-        <w:t xml:space="preserve">.requiredAction}. </w:t>
-      </w:r>
-    </w:p>
-    <w:p>
-      <w:pPr>
-        <w:pStyle w:val="BodyText"/>
-        <w:rPr/>
-      </w:pPr>
-      <w:r>
-        <w:rPr/>
-      </w:r>
-    </w:p>
-    <w:p>
-      <w:pPr>
-        <w:pStyle w:val="BodyText"/>
-        <w:rPr/>
-      </w:pPr>
-      <w:r>
-        <w:rPr/>
-        <w:t xml:space="preserve">S.2 Instruction: You are a cybersecurity expert that has been trained to give precise responses to complex cybersecurity questions. You work in a SOC protecting data for enterprise customers helping to protect their digital assets. Question: Explain the significance of </w:t>
-      </w:r>
-      <w:r>
-        <w:rPr/>
-        <w:t xml:space="preserve">the due date </w:t>
-      </w:r>
-      <w:r>
-        <w:rPr/>
-        <w:t xml:space="preserve">for </w:t>
-      </w:r>
-      <w:r>
-        <w:rPr/>
-        <w:t xml:space="preserve">KEV </w:t>
-      </w:r>
-      <w:r>
-        <w:rPr/>
-        <w:t>{ke</w:t>
-      </w:r>
-      <w:r>
-        <w:rPr/>
-        <w:t>v</w:t>
-      </w:r>
-      <w:r>
-        <w:rPr/>
-        <w:t>:</w:t>
-      </w:r>
-      <w:r>
-        <w:rPr/>
-        <w:t>KEV</w:t>
-      </w:r>
-      <w:r>
-        <w:rPr/>
-        <w:t>.</w:t>
-      </w:r>
-      <w:r>
-        <w:rPr/>
-        <w:t>cveID</w:t>
-      </w:r>
-      <w:r>
-        <w:rPr/>
-        <w:t>}, {</w:t>
-      </w:r>
-      <w:r>
-        <w:rPr/>
-        <w:t>kev</w:t>
-      </w:r>
-      <w:r>
-        <w:rPr/>
-        <w:t>.vulnerabilityName}. Answer: Patching for {</w:t>
-      </w:r>
-      <w:r>
-        <w:rPr/>
-        <w:t>kev.cveID</w:t>
-      </w:r>
-      <w:r>
-        <w:rPr/>
-        <w:t>} ({</w:t>
-      </w:r>
-      <w:r>
-        <w:rPr/>
-        <w:t>kev</w:t>
-      </w:r>
-      <w:r>
-        <w:rPr/>
-        <w:t>.vulnerabilityName}) is due by {</w:t>
-      </w:r>
-      <w:r>
-        <w:rPr/>
-        <w:t>kev</w:t>
-      </w:r>
-      <w:r>
-        <w:rPr/>
-        <w:t xml:space="preserve">.dueDate}. Meeting this deadline ensures compliance with BOD 22-01 and reduces exposure to active exploitation. </w:t>
-      </w:r>
-    </w:p>
-    <w:p>
-      <w:pPr>
-        <w:pStyle w:val="BodyText"/>
-        <w:rPr/>
-      </w:pPr>
-      <w:r>
-        <w:rPr/>
-      </w:r>
-    </w:p>
-    <w:p>
-      <w:pPr>
-        <w:pStyle w:val="BodyText"/>
-        <w:rPr/>
-      </w:pPr>
-      <w:r>
-        <w:rPr/>
-        <w:t xml:space="preserve">S.3 Instruction: You are a cybersecurity expert that has been trained to give precise responses to complex cybersecurity questions. You work in a SOC protecting data for enterprise customers helping to protect their digital assets. Question: Identify if </w:t>
-      </w:r>
-      <w:r>
-        <w:rPr/>
-        <w:t>KEV</w:t>
-      </w:r>
-      <w:r>
-        <w:rPr/>
-        <w:t>{</w:t>
-      </w:r>
-      <w:r>
-        <w:rPr/>
-        <w:t>kev</w:t>
-      </w:r>
-      <w:r>
-        <w:rPr/>
-        <w:t>:KVE.vulnerabilityName} in {</w:t>
-      </w:r>
-      <w:r>
-        <w:rPr/>
-        <w:t>kev</w:t>
-      </w:r>
-      <w:r>
-        <w:rPr/>
-        <w:t xml:space="preserve">.product} is associated with ransomware activity. Answer: </w:t>
-      </w:r>
-      <w:r>
-        <w:rPr/>
-        <w:t xml:space="preserve">KEV </w:t>
-      </w:r>
-      <w:r>
-        <w:rPr/>
-        <w:t>{</w:t>
-      </w:r>
-      <w:r>
-        <w:rPr/>
-        <w:t>kev</w:t>
-      </w:r>
-      <w:r>
-        <w:rPr/>
-        <w:t xml:space="preserve">.vulnerabilityName} </w:t>
-      </w:r>
-      <w:r>
-        <w:rPr/>
-        <w:t>maps to CVE {kev.cveID}</w:t>
-      </w:r>
-      <w:r>
-        <w:rPr/>
-        <w:t xml:space="preserve"> in </w:t>
-      </w:r>
-      <w:r>
-        <w:rPr/>
-        <w:t xml:space="preserve">product </w:t>
-      </w:r>
-      <w:r>
-        <w:rPr/>
-        <w:t>{</w:t>
-      </w:r>
-      <w:r>
-        <w:rPr/>
-        <w:t>kev</w:t>
-      </w:r>
-      <w:r>
-        <w:rPr/>
-        <w:t xml:space="preserve">.product} </w:t>
-      </w:r>
-      <w:r>
-        <w:rPr/>
-        <w:t xml:space="preserve">and it </w:t>
-      </w:r>
-      <w:r>
-        <w:rPr/>
-        <w:t>has {</w:t>
-      </w:r>
-      <w:r>
-        <w:rPr/>
-        <w:t>kev</w:t>
-      </w:r>
-      <w:r>
-        <w:rPr/>
-        <w:t xml:space="preserve">.knownRansomwareCampaignUse} ransomware association. Immediate patching is recommended for higher risk. </w:t>
-      </w:r>
-    </w:p>
-    <w:p>
-      <w:pPr>
-        <w:pStyle w:val="BodyText"/>
-        <w:rPr/>
-      </w:pPr>
-      <w:r>
-        <w:rPr/>
-      </w:r>
-    </w:p>
-    <w:p>
-      <w:pPr>
-        <w:pStyle w:val="BodyText"/>
-        <w:rPr/>
-      </w:pPr>
-      <w:r>
-        <w:rPr/>
-        <w:t xml:space="preserve">S.4 Instruction: You are a cybersecurity expert that has been trained to give precise responses to complex cybersecurity questions. You work in a SOC protecting data for enterprise customers helping to protect their digital assets. Question: Summarize the technical impact and mitigation for </w:t>
-      </w:r>
-      <w:r>
-        <w:rPr/>
-        <w:t xml:space="preserve">KEV </w:t>
-      </w:r>
-      <w:r>
-        <w:rPr/>
-        <w:t>{ke</w:t>
-      </w:r>
-      <w:r>
-        <w:rPr/>
-        <w:t>v</w:t>
-      </w:r>
-      <w:r>
-        <w:rPr/>
-        <w:t>:K</w:t>
-      </w:r>
-      <w:r>
-        <w:rPr/>
-        <w:t>EV</w:t>
-      </w:r>
-      <w:r>
-        <w:rPr/>
-        <w:t xml:space="preserve">.vulnerabilityName} in </w:t>
-      </w:r>
-      <w:r>
-        <w:rPr/>
-        <w:t xml:space="preserve">product </w:t>
-      </w:r>
-      <w:r>
-        <w:rPr/>
-        <w:t>{</w:t>
-      </w:r>
-      <w:r>
-        <w:rPr/>
-        <w:t>kev</w:t>
-      </w:r>
-      <w:r>
-        <w:rPr/>
-        <w:t xml:space="preserve">.product}. Answer: </w:t>
-      </w:r>
-      <w:r>
-        <w:rPr/>
-        <w:t xml:space="preserve">KEV </w:t>
-      </w:r>
-      <w:r>
-        <w:rPr/>
-        <w:t>{</w:t>
-      </w:r>
-      <w:r>
-        <w:rPr/>
-        <w:t>kev</w:t>
-      </w:r>
-      <w:r>
-        <w:rPr/>
-        <w:t xml:space="preserve">.vulnerabilityName} </w:t>
-      </w:r>
-      <w:r>
-        <w:rPr/>
-        <w:t xml:space="preserve">maps to CVE {kev.cveID} and it </w:t>
-      </w:r>
-      <w:r>
-        <w:rPr/>
-        <w:t>causes: {</w:t>
-      </w:r>
-      <w:r>
-        <w:rPr/>
-        <w:t>kev</w:t>
-      </w:r>
-      <w:r>
-        <w:rPr/>
-        <w:t>.shortDescription}. Mitigation: {</w:t>
-      </w:r>
-      <w:r>
-        <w:rPr/>
-        <w:t>kev</w:t>
-      </w:r>
-      <w:r>
-        <w:rPr/>
-        <w:t xml:space="preserve">.requiredAction}. Listed in KEV - patch immediately. </w:t>
-      </w:r>
-    </w:p>
-    <w:p>
-      <w:pPr>
-        <w:pStyle w:val="BodyText"/>
-        <w:rPr/>
-      </w:pPr>
-      <w:r>
-        <w:rPr/>
-      </w:r>
-    </w:p>
-    <w:p>
-      <w:pPr>
-        <w:pStyle w:val="BodyText"/>
-        <w:rPr/>
-      </w:pPr>
-      <w:r>
-        <w:rPr/>
-        <w:t xml:space="preserve">S.5 Instruction: You are a cybersecurity expert that has been trained to give precise responses to complex cybersecurity questions. You work in a SOC protecting data for enterprise customers helping to protect their digital assets. Question: Generate a detailed patching advisory for </w:t>
-      </w:r>
-      <w:r>
-        <w:rPr/>
-        <w:t xml:space="preserve">KEV </w:t>
-      </w:r>
-      <w:r>
-        <w:rPr/>
-        <w:t>{k</w:t>
-      </w:r>
-      <w:r>
-        <w:rPr/>
-        <w:t>ev</w:t>
-      </w:r>
-      <w:r>
-        <w:rPr/>
-        <w:t>:K</w:t>
-      </w:r>
-      <w:r>
-        <w:rPr/>
-        <w:t>EV</w:t>
-      </w:r>
-      <w:r>
-        <w:rPr/>
-        <w:t xml:space="preserve">.vulnerabilityName} in </w:t>
-      </w:r>
-      <w:r>
-        <w:rPr/>
-        <w:t xml:space="preserve">product </w:t>
-      </w:r>
-      <w:r>
-        <w:rPr/>
-        <w:t>{</w:t>
-      </w:r>
-      <w:r>
-        <w:rPr/>
-        <w:t>kev</w:t>
-      </w:r>
-      <w:r>
-        <w:rPr/>
-        <w:t xml:space="preserve">.product} </w:t>
-      </w:r>
-      <w:r>
-        <w:rPr/>
-        <w:t>from {kev.vendorProject}</w:t>
-      </w:r>
-      <w:r>
-        <w:rPr/>
-        <w:t>. Answer: Vulnerability {</w:t>
-      </w:r>
-      <w:r>
-        <w:rPr/>
-        <w:t>kev</w:t>
-      </w:r>
-      <w:r>
-        <w:rPr/>
-        <w:t xml:space="preserve">.vulnerabilityName} </w:t>
-      </w:r>
-      <w:r>
-        <w:rPr/>
-        <w:t xml:space="preserve">maps to CVE  {kev.cveID} and it is explied </w:t>
-      </w:r>
-      <w:r>
-        <w:rPr/>
-        <w:t>in {k</w:t>
-      </w:r>
-      <w:r>
-        <w:rPr/>
-        <w:t>ev</w:t>
-      </w:r>
-      <w:r>
-        <w:rPr/>
-        <w:t>.product} (</w:t>
-      </w:r>
-      <w:r>
-        <w:rPr/>
-        <w:t xml:space="preserve">vendor </w:t>
-      </w:r>
-      <w:r>
-        <w:rPr/>
-        <w:t>{</w:t>
-      </w:r>
-      <w:r>
-        <w:rPr/>
-        <w:t>kev</w:t>
-      </w:r>
-      <w:r>
-        <w:rPr/>
-        <w:t>.vendorProject}) is actively exploited. Detailed advisory: {</w:t>
-      </w:r>
-      <w:r>
-        <w:rPr/>
-        <w:t>kev</w:t>
-      </w:r>
-      <w:r>
-        <w:rPr/>
-        <w:t>.shortDescription}. Recommended action: {</w:t>
-      </w:r>
-      <w:r>
-        <w:rPr/>
-        <w:t>kev</w:t>
-      </w:r>
-      <w:r>
-        <w:rPr/>
-        <w:t>.requiredAction} before {</w:t>
-      </w:r>
-      <w:r>
-        <w:rPr/>
-        <w:t>kev</w:t>
-      </w:r>
-      <w:r>
-        <w:rPr/>
-        <w:t xml:space="preserve">.dueDate}. </w:t>
-      </w:r>
-    </w:p>
-    <w:p>
-      <w:pPr>
-        <w:pStyle w:val="BodyText"/>
-        <w:rPr/>
-      </w:pPr>
-      <w:r>
-        <w:rPr/>
-      </w:r>
-    </w:p>
-    <w:p>
-      <w:pPr>
-        <w:pStyle w:val="BodyText"/>
-        <w:rPr/>
-      </w:pPr>
-      <w:r>
-        <w:rPr/>
-        <w:t xml:space="preserve">S.6 Instruction: You are a cybersecurity expert that has been trained to give precise responses to complex cybersecurity questions. You work in a SOC protecting data for enterprise customers helping to protect their digital assets. Question: Provide a technical summary for </w:t>
-      </w:r>
-      <w:r>
-        <w:rPr/>
-        <w:t>KEV</w:t>
-      </w:r>
-      <w:r>
-        <w:rPr/>
-        <w:t xml:space="preserve"> {ke</w:t>
-      </w:r>
-      <w:r>
-        <w:rPr/>
-        <w:t>v</w:t>
-      </w:r>
-      <w:r>
-        <w:rPr/>
-        <w:t>:</w:t>
-      </w:r>
-      <w:r>
-        <w:rPr/>
-        <w:t>KEV</w:t>
-      </w:r>
-      <w:r>
-        <w:rPr/>
-        <w:t xml:space="preserve">.vulnerabilityName} </w:t>
-      </w:r>
-      <w:r>
-        <w:rPr/>
-        <w:t xml:space="preserve">(CVE {kev.cveID}) </w:t>
-      </w:r>
-      <w:r>
-        <w:rPr/>
-        <w:t xml:space="preserve">in {kve:KVE.product} </w:t>
-      </w:r>
-      <w:r>
-        <w:rPr/>
-        <w:t>from {kev.vendorProject}</w:t>
-      </w:r>
-      <w:r>
-        <w:rPr/>
-        <w:t xml:space="preserve">, including its weakness type. Answer: </w:t>
-      </w:r>
-      <w:r>
-        <w:rPr/>
-        <w:t xml:space="preserve">KEV </w:t>
-      </w:r>
-      <w:r>
-        <w:rPr/>
-        <w:t xml:space="preserve">{kve:KVE.vulnerabilityName} </w:t>
-      </w:r>
-      <w:r>
-        <w:rPr/>
-        <w:t>with CVE ID {kev.cveID}</w:t>
-      </w:r>
-      <w:r>
-        <w:rPr/>
-        <w:t xml:space="preserve"> affects {</w:t>
-      </w:r>
-      <w:r>
-        <w:rPr/>
-        <w:t>kev</w:t>
-      </w:r>
-      <w:r>
-        <w:rPr/>
-        <w:t>.product} (</w:t>
-      </w:r>
-      <w:r>
-        <w:rPr/>
-        <w:t xml:space="preserve">from </w:t>
-      </w:r>
-      <w:r>
-        <w:rPr/>
-        <w:t>{</w:t>
-      </w:r>
-      <w:r>
-        <w:rPr/>
-        <w:t>kev</w:t>
-      </w:r>
-      <w:r>
-        <w:rPr/>
-        <w:t>.vendorProject}). Description: {</w:t>
-      </w:r>
-      <w:r>
-        <w:rPr/>
-        <w:t>kev</w:t>
-      </w:r>
-      <w:r>
-        <w:rPr/>
-        <w:t>.shortDescription}. Mitigation: {</w:t>
-      </w:r>
-      <w:r>
-        <w:rPr/>
-        <w:t>kev</w:t>
-      </w:r>
-      <w:r>
-        <w:rPr/>
-        <w:t>.requiredAction}. Weakness(es) involved: {k</w:t>
-      </w:r>
-      <w:r>
-        <w:rPr/>
-        <w:t>ev</w:t>
-      </w:r>
-      <w:r>
-        <w:rPr/>
-        <w:t xml:space="preserve">:cwes}. </w:t>
-      </w:r>
-    </w:p>
-    <w:p>
-      <w:pPr>
-        <w:pStyle w:val="BodyText"/>
-        <w:rPr/>
-      </w:pPr>
-      <w:r>
-        <w:rPr/>
-      </w:r>
-    </w:p>
-    <w:p>
-      <w:pPr>
-        <w:pStyle w:val="BodyText"/>
-        <w:rPr/>
-      </w:pPr>
-      <w:commentRangeStart w:id="22"/>
+        <w:t xml:space="preserve">.vulnerabilityName} with CVE ID {kev.cveID} affects {kev.product} (from {kev.vendorProject}). Description: {kev.shortDescription}. Mitigation: {kev.requiredAction}. Weakness(es) involved: {kev:cwes}. </w:t>
+      </w:r>
+    </w:p>
+    <w:p>
+      <w:pPr>
+        <w:pStyle w:val="BodyText"/>
+        <w:rPr/>
+      </w:pPr>
+      <w:r>
+        <w:rPr/>
+      </w:r>
+    </w:p>
+    <w:p>
+      <w:pPr>
+        <w:pStyle w:val="BodyText"/>
+        <w:rPr/>
+      </w:pPr>
+      <w:commentRangeStart w:id="24"/>
       <w:r>
         <w:rPr/>
         <w:t>S.7 Instruction</w:t>
@@ -2924,111 +2524,19 @@
       <w:r>
         <w:rPr/>
       </w:r>
-      <w:commentRangeEnd w:id="22"/>
-      <w:r>
-        <w:commentReference w:id="22"/>
-      </w:r>
-      <w:r>
-        <w:rPr/>
-        <w:t>: You are a cybersecurity expert that has been trained to give precise responses to complex cybersecurity questions. You work in a SOC protecting data for enterprise customers helping to protect their digital assets. Question: For an organization running {k</w:t>
-      </w:r>
-      <w:r>
-        <w:rPr/>
-        <w:t>ev</w:t>
-      </w:r>
-      <w:r>
-        <w:rPr/>
-        <w:t>:K</w:t>
-      </w:r>
-      <w:r>
-        <w:rPr/>
-        <w:t>EV</w:t>
-      </w:r>
-      <w:r>
-        <w:rPr/>
-        <w:t>.product}, what is the recommended immediate action to mitigate the risk of exploitation for K</w:t>
-      </w:r>
-      <w:r>
-        <w:rPr/>
-        <w:t>EV</w:t>
-      </w:r>
-      <w:r>
-        <w:rPr/>
-        <w:t xml:space="preserve"> {</w:t>
-      </w:r>
-      <w:r>
-        <w:rPr/>
-        <w:t>kev.cveID</w:t>
-      </w:r>
-      <w:r>
-        <w:rPr/>
-        <w:t>}</w:t>
+      <w:commentRangeEnd w:id="24"/>
+      <w:r>
+        <w:commentReference w:id="24"/>
+      </w:r>
+      <w:r>
+        <w:rPr/>
+        <w:t>: You are a cybersecurity expert that has been trained to give precise responses to complex cybersecurity questions. You work in a SOC protecting data for enterprise customers helping to protect their digital assets. Question: For an organization running {kev:KEV.product}, what is the recommended immediate action to mitigate the risk of exploitation for KEV {kev.cveID}</w:t>
       </w:r>
       <w:bookmarkStart w:id="0" w:name="p-rc_770360de88e3d17d-63"/>
-      <w:r>
-        <w:rPr/>
-        <w:t>?</w:t>
-      </w:r>
       <w:bookmarkEnd w:id="0"/>
       <w:r>
         <w:rPr/>
-        <w:t xml:space="preserve"> Answer: For systems running {</w:t>
-      </w:r>
-      <w:r>
-        <w:rPr/>
-        <w:t>kev</w:t>
-      </w:r>
-      <w:r>
-        <w:rPr/>
-        <w:t xml:space="preserve">.product} </w:t>
-      </w:r>
-      <w:r>
-        <w:rPr/>
-        <w:t xml:space="preserve">from </w:t>
-      </w:r>
-      <w:r>
-        <w:rPr/>
-        <w:t>{</w:t>
-      </w:r>
-      <w:r>
-        <w:rPr/>
-        <w:t>kev</w:t>
-      </w:r>
-      <w:r>
-        <w:rPr/>
-        <w:t xml:space="preserve">.vendorProject} affected by </w:t>
-      </w:r>
-      <w:r>
-        <w:rPr/>
-        <w:t xml:space="preserve">KEV </w:t>
-      </w:r>
-      <w:r>
-        <w:rPr/>
-        <w:t>{</w:t>
-      </w:r>
-      <w:r>
-        <w:rPr/>
-        <w:t>kev.cveID</w:t>
-      </w:r>
-      <w:r>
-        <w:rPr/>
-        <w:t>} ({</w:t>
-      </w:r>
-      <w:r>
-        <w:rPr/>
-        <w:t>kev</w:t>
-      </w:r>
-      <w:r>
-        <w:rPr/>
-        <w:t>.vulnerabilityName}), the recommended immediate action is: {</w:t>
-      </w:r>
-      <w:r>
-        <w:rPr/>
-        <w:t>kev</w:t>
-      </w:r>
-      <w:r>
-        <w:rPr/>
-        <w:t>.requiredAction}.</w:t>
+        <w:t>? Answer: For systems running {kev.product} from {kev.vendorProject} affected by KEV {kev.cveID} ({kev.vulnerabilityName}), the recommended immediate action is: {kev.requiredAction}.</w:t>
       </w:r>
     </w:p>
     <w:p>
@@ -3290,7 +2798,7 @@
         <w:rPr/>
         <w:t xml:space="preserve">W.4 Instruction: You are a cybersecurity expert that has been trained to give precise responses to complex cybersecurity questions. You work in a SOC protecting data for enterprise customers helping to protect their digital assets. Question: How can {cwe:Weakness.name} (CWE-{cwe.id}) be detected and prevented? Answer: {cwe.name} can be detected with this detection method: {cwe.detected_by.method} To prevent it, apply </w:t>
       </w:r>
-      <w:commentRangeStart w:id="23"/>
+      <w:commentRangeStart w:id="25"/>
       <w:r>
         <w:rPr/>
         <w:t>this mitigation</w:t>
@@ -3298,9 +2806,9 @@
       <w:r>
         <w:rPr/>
       </w:r>
-      <w:commentRangeEnd w:id="23"/>
-      <w:r>
-        <w:commentReference w:id="23"/>
+      <w:commentRangeEnd w:id="25"/>
+      <w:r>
+        <w:commentReference w:id="25"/>
       </w:r>
       <w:r>
         <w:rPr/>
@@ -3548,7 +3056,7 @@
         <w:rPr/>
         <w:t xml:space="preserve">E.1 Instruction: You are a cybersecurity expert that has been trained to give precise responses to complex cybersecurity questions. You work in a SOC protecting data for enterprise customers helping to protect their digital assets. Question: Describe how defenders can detect or disrupt the technique {ap:attack-pattern.name} ({ap.id}). </w:t>
       </w:r>
-      <w:commentRangeStart w:id="24"/>
+      <w:commentRangeStart w:id="26"/>
       <w:r>
         <w:rPr/>
         <w:t>Answer</w:t>
@@ -3556,9 +3064,9 @@
       <w:r>
         <w:rPr/>
       </w:r>
-      <w:commentRangeEnd w:id="24"/>
-      <w:r>
-        <w:commentReference w:id="24"/>
+      <w:commentRangeEnd w:id="26"/>
+      <w:r>
+        <w:commentReference w:id="26"/>
       </w:r>
       <w:r>
         <w:rPr/>
@@ -3612,30 +3120,14 @@
         <w:rPr/>
         <w:t xml:space="preserve">E.2 Instruction: You are a cybersecurity expert that has been trained to give precise responses to complex cybersecurity questions. You work in a SOC protecting data for enterprise customers helping to protect their digital assets. Question: Explain how deception can be applied against the technique {ap:attack-pattern.name} ({ap.id}). </w:t>
       </w:r>
-      <w:commentRangeStart w:id="25"/>
-      <w:r>
-        <w:rPr/>
-        <w:t>Answer: Deception can be applied against {ap.name} by deploying decoy systems or false targets that attract and expose adversary actions as defined in {ap.x_mitre_detection</w:t>
-      </w:r>
-      <w:r>
-        <w:rPr/>
-        <w:t>[_</w:t>
-      </w:r>
-      <w:r>
-        <w:rPr/>
-        <w:t>!</w:t>
-      </w:r>
-      <w:r>
-        <w:rPr/>
-        <w:t>=""]</w:t>
-      </w:r>
-      <w:r>
-        <w:rPr/>
-        <w:t xml:space="preserve">}. </w:t>
-      </w:r>
-      <w:commentRangeEnd w:id="25"/>
-      <w:r>
-        <w:commentReference w:id="25"/>
+      <w:commentRangeStart w:id="27"/>
+      <w:r>
+        <w:rPr/>
+        <w:t xml:space="preserve">Answer: Deception can be applied against {ap.name} by deploying decoy systems or false targets that attract and expose adversary actions as defined in {ap.x_mitre_detection[_!=""]}. </w:t>
+      </w:r>
+      <w:commentRangeEnd w:id="27"/>
+      <w:r>
+        <w:commentReference w:id="27"/>
       </w:r>
       <w:r>
         <w:rPr/>
@@ -3659,7 +3151,7 @@
         <w:rPr/>
         <w:t xml:space="preserve">E.3 Instruction: You are a cybersecurity expert that has been trained to give precise responses to complex cybersecurity questions. You work in a SOC protecting data for enterprise customers helping to protect their digital assets. </w:t>
       </w:r>
-      <w:commentRangeStart w:id="26"/>
+      <w:commentRangeStart w:id="28"/>
       <w:r>
         <w:rPr/>
         <w:t>Question:</w:t>
@@ -3667,9 +3159,9 @@
       <w:r>
         <w:rPr/>
       </w:r>
-      <w:commentRangeEnd w:id="26"/>
-      <w:r>
-        <w:commentReference w:id="26"/>
+      <w:commentRangeEnd w:id="28"/>
+      <w:r>
+        <w:commentReference w:id="28"/>
       </w:r>
       <w:r>
         <w:rPr/>
@@ -3704,7 +3196,7 @@
         <w:rPr/>
         <w:t xml:space="preserve">E.4 Instruction: You are a cybersecurity expert that has been trained to give precise responses to complex cybersecurity questions. You work in a SOC protecting data for enterprise customers helping to protect their digital assets. </w:t>
       </w:r>
-      <w:commentRangeStart w:id="27"/>
+      <w:commentRangeStart w:id="29"/>
       <w:r>
         <w:rPr/>
         <w:t>Question</w:t>
@@ -3712,9 +3204,9 @@
       <w:r>
         <w:rPr/>
       </w:r>
-      <w:commentRangeEnd w:id="27"/>
-      <w:r>
-        <w:commentReference w:id="27"/>
+      <w:commentRangeEnd w:id="29"/>
+      <w:r>
+        <w:commentReference w:id="29"/>
       </w:r>
       <w:r>
         <w:rPr/>
@@ -3739,7 +3231,7 @@
         <w:rPr/>
         <w:t xml:space="preserve">E.5 Instruction: You are a cybersecurity expert that has been trained to give precise responses to complex cybersecurity questions. You work in a SOC protecting data for enterprise customers helping to protect their digital assets. </w:t>
       </w:r>
-      <w:commentRangeStart w:id="28"/>
+      <w:commentRangeStart w:id="30"/>
       <w:r>
         <w:rPr/>
         <w:t>Question</w:t>
@@ -3747,21 +3239,13 @@
       <w:r>
         <w:rPr/>
       </w:r>
-      <w:commentRangeEnd w:id="28"/>
-      <w:r>
-        <w:commentReference w:id="28"/>
-      </w:r>
-      <w:r>
-        <w:rPr/>
-        <w:t>: Describe how defenders can mislead adversaries using {ap:</w:t>
-      </w:r>
-      <w:r>
-        <w:rPr/>
-        <w:t>attack-pattern</w:t>
-      </w:r>
-      <w:r>
-        <w:rPr/>
-        <w:t>.name} ({ap.id}). Answer: Defenders can mislead adversaries by introducing deceptive configurations or honeypots that mimic assets targeted by {ap.name}, supported by detections methods as follows: {ap.x_mitre_detection}</w:t>
+      <w:commentRangeEnd w:id="30"/>
+      <w:r>
+        <w:commentReference w:id="30"/>
+      </w:r>
+      <w:r>
+        <w:rPr/>
+        <w:t>: Describe how defenders can mislead adversaries using {ap:attack-pattern.name} ({ap.id}). Answer: Defenders can mislead adversaries by introducing deceptive configurations or honeypots that mimic assets targeted by {ap.name}, supported by detections methods as follows: {ap.x_mitre_detection}</w:t>
       </w:r>
     </w:p>
     <w:p>
@@ -3782,7 +3266,7 @@
         <w:rPr/>
         <w:t xml:space="preserve">E.6 Instruction: You are a cybersecurity expert that has been trained to give precise responses to complex cybersecurity questions. You work in a SOC protecting data for enterprise customers helping to protect their digital assets. </w:t>
       </w:r>
-      <w:commentRangeStart w:id="29"/>
+      <w:commentRangeStart w:id="31"/>
       <w:r>
         <w:rPr/>
         <w:t>Question</w:t>
@@ -3790,9 +3274,9 @@
       <w:r>
         <w:rPr/>
       </w:r>
-      <w:commentRangeEnd w:id="29"/>
-      <w:r>
-        <w:commentReference w:id="29"/>
+      <w:commentRangeEnd w:id="31"/>
+      <w:r>
+        <w:commentReference w:id="31"/>
       </w:r>
       <w:r>
         <w:rPr/>
@@ -3854,15 +3338,7 @@
       </w:pPr>
       <w:r>
         <w:rPr/>
-        <w:t>M.2 Instruction: You are a cybersecurity expert that has been trained to give precise responses to complex cybersecurity questions. You work in a SOC protecting data for enterprise customers helping to protect their digital assets. Question: What are the defensive measures against teachnique with ID {ap:attack-pattern.id}? Answer: One set of defensive measures against attack pattern {ap.name} (ID {ap.id}) is the following: {coa:ap.mitigatate</w:t>
-      </w:r>
-      <w:r>
-        <w:rPr/>
-        <w:t>s&lt;</w:t>
-      </w:r>
-      <w:r>
-        <w:rPr/>
-        <w:t xml:space="preserve">.description}. </w:t>
+        <w:t xml:space="preserve">M.2 Instruction: You are a cybersecurity expert that has been trained to give precise responses to complex cybersecurity questions. You work in a SOC protecting data for enterprise customers helping to protect their digital assets. Question: What are the defensive measures against teachnique with ID {ap:attack-pattern.id}? Answer: One set of defensive measures against attack pattern {ap.name} (ID {ap.id}) is the following: {coa:ap.mitigatates&lt;.description}. </w:t>
       </w:r>
     </w:p>
     <w:p>
@@ -3969,7 +3445,7 @@
       </w:pPr>
       <w:r>
         <w:rPr/>
-        <w:t>M.5 Instruction: You are a cybersecurity expert that has been trained to give precise responses to complex cybersecurity questions. You work in a SOC protecting data for enterprise customers helping to protect their digital assets. Question: How can attack pattern {ap:attack-pattern.id} be detected in network traffic? Answer: {ap.name} (ID {ap.id}) can be detected in network traffic by monitoring {ap.x_mitre_data_sources[?^"Network Traffic"} in the following way: {ap.x_mitre_detection}</w:t>
+        <w:t>M.5 Instruction: You are a cybersecurity expert that has been trained to give precise responses to complex cybersecurity questions. You work in a SOC protecting data for enterprise customers helping to protect their digital assets. Question: How can attack pattern {ap:attack-pattern.id} be detected in network traffic? Answer: {ap.name} (ID {ap.id}) can be detected in network traffic by monitoring {ap.x_mitre_data_sources[?~"Network Traffic"} in the following way: {ap.x_mitre_detection}</w:t>
       </w:r>
     </w:p>
     <w:p>
@@ -4039,6 +3515,22 @@
         </w:rPr>
       </w:pPr>
       <w:r>
+        <w:rPr/>
+      </w:r>
+    </w:p>
+    <w:p>
+      <w:pPr>
+        <w:pStyle w:val="Normal"/>
+        <w:jc w:val="start"/>
+        <w:rPr>
+          <w:rFonts w:ascii="Liberation Sans;Arial" w:hAnsi="Liberation Sans;Arial" w:eastAsia="Noto Sans CJK SC" w:cs="Liberation Sans;Arial"/>
+          <w:b/>
+          <w:bCs/>
+          <w:sz w:val="32"/>
+          <w:szCs w:val="32"/>
+        </w:rPr>
+      </w:pPr>
+      <w:r>
         <w:rPr>
           <w:rFonts w:eastAsia="Noto Sans CJK SC" w:cs="Liberation Sans;Arial" w:ascii="Liberation Sans;Arial" w:hAnsi="Liberation Sans;Arial"/>
           <w:b/>
@@ -4046,6 +3538,246 @@
           <w:sz w:val="32"/>
           <w:szCs w:val="32"/>
         </w:rPr>
+        <w:t>Custom Templates</w:t>
+      </w:r>
+    </w:p>
+    <w:p>
+      <w:pPr>
+        <w:pStyle w:val="Normal"/>
+        <w:jc w:val="start"/>
+        <w:rPr>
+          <w:rFonts w:ascii="Liberation Sans;Arial" w:hAnsi="Liberation Sans;Arial" w:eastAsia="Noto Sans CJK SC" w:cs="Liberation Sans;Arial"/>
+          <w:b/>
+          <w:bCs/>
+          <w:sz w:val="32"/>
+          <w:szCs w:val="32"/>
+        </w:rPr>
+      </w:pPr>
+      <w:r>
+        <w:rPr>
+          <w:rFonts w:eastAsia="Noto Sans CJK SC" w:cs="Liberation Sans;Arial" w:ascii="Liberation Sans;Arial" w:hAnsi="Liberation Sans;Arial"/>
+          <w:b/>
+          <w:bCs/>
+          <w:sz w:val="32"/>
+          <w:szCs w:val="32"/>
+        </w:rPr>
+      </w:r>
+    </w:p>
+    <w:p>
+      <w:pPr>
+        <w:pStyle w:val="Normal"/>
+        <w:rPr/>
+      </w:pPr>
+      <w:r>
+        <w:rPr/>
+        <w:t>Next is a c</w:t>
+      </w:r>
+      <w:r>
+        <w:rPr/>
+        <w:t xml:space="preserve">ustom template with a longer path, </w:t>
+      </w:r>
+      <w:r>
+        <w:rPr/>
+        <w:t>for demo purpose:</w:t>
+      </w:r>
+    </w:p>
+    <w:p>
+      <w:pPr>
+        <w:pStyle w:val="Normal"/>
+        <w:rPr/>
+      </w:pPr>
+      <w:r>
+        <w:rPr/>
+      </w:r>
+    </w:p>
+    <w:p>
+      <w:pPr>
+        <w:pStyle w:val="Normal"/>
+        <w:rPr/>
+      </w:pPr>
+      <w:r>
+        <w:rPr/>
+        <w:t>longpath.1 Instruction: You are a cybersecurity expert that has been trained to give precise responses to complex cybersecurity questions. You work in a SOC protecting data for enterprise customers helping to protect their digital assets. Question: Which technique and malware are used by both intrusion sets {is1:intrusion-set.name} (ID {is</w:t>
+      </w:r>
+      <w:r>
+        <w:rPr/>
+        <w:t>1</w:t>
+      </w:r>
+      <w:r>
+        <w:rPr/>
+        <w:t xml:space="preserve">.id}) and {is2:intrusion-set.name} (ID {is2.id})? Recommend a course of action for that technique. Answer: An attack pattern used by both intrusion sets {is1.name} and {is2.name} is </w:t>
+      </w:r>
+      <w:r>
+        <w:rPr/>
+        <w:t>{ap</w:t>
+      </w:r>
+      <w:r>
+        <w:rPr/>
+        <w:t>1</w:t>
+      </w:r>
+      <w:r>
+        <w:rPr/>
+        <w:t>:is1.uses&gt;attack-pattern.name} (ID {ap</w:t>
+      </w:r>
+      <w:r>
+        <w:rPr/>
+        <w:t>1</w:t>
+      </w:r>
+      <w:r>
+        <w:rPr/>
+        <w:t>.id}). Both intrusion sets rely on malware {m</w:t>
+      </w:r>
+      <w:r>
+        <w:rPr/>
+        <w:t>1</w:t>
+      </w:r>
+      <w:r>
+        <w:rPr/>
+        <w:t>:is1.uses&gt;malware.name} (ID {m</w:t>
+      </w:r>
+      <w:r>
+        <w:rPr/>
+        <w:t>1</w:t>
+      </w:r>
+      <w:r>
+        <w:rPr/>
+        <w:t xml:space="preserve">.id}). </w:t>
+      </w:r>
+      <w:r>
+        <w:rPr/>
+        <w:t>A course of action recommended for that technique is {</w:t>
+      </w:r>
+      <w:r>
+        <w:rPr>
+          <w:shd w:fill="FFFF00" w:val="clear"/>
+        </w:rPr>
+        <w:t>coa1:ap1.mitigates</w:t>
+      </w:r>
+      <w:commentRangeStart w:id="32"/>
+      <w:r>
+        <w:rPr>
+          <w:shd w:fill="FFFF00" w:val="clear"/>
+        </w:rPr>
+        <w:t>&lt;</w:t>
+      </w:r>
+      <w:r>
+        <w:rPr>
+          <w:shd w:fill="FFFF00" w:val="clear"/>
+        </w:rPr>
+      </w:r>
+      <w:commentRangeEnd w:id="32"/>
+      <w:r>
+        <w:commentReference w:id="32"/>
+      </w:r>
+      <w:r>
+        <w:rPr>
+          <w:shd w:fill="FFFF00" w:val="clear"/>
+        </w:rPr>
+        <w:t>.name</w:t>
+      </w:r>
+      <w:r>
+        <w:rPr/>
+        <w:t xml:space="preserve">}.  </w:t>
+      </w:r>
+      <w:r>
+        <w:rPr/>
+        <w:t>&lt;* this is an 'invisible' constraint: {ap2:is2.uses&gt;attack-pattern.id} {</w:t>
+      </w:r>
+      <w:commentRangeStart w:id="33"/>
+      <w:r>
+        <w:rPr/>
+        <w:t>force  ap1.id=ap2.id</w:t>
+      </w:r>
+      <w:r>
+        <w:rPr/>
+      </w:r>
+      <w:commentRangeEnd w:id="33"/>
+      <w:r>
+        <w:commentReference w:id="33"/>
+      </w:r>
+      <w:r>
+        <w:rPr/>
+        <w:t>}  {m</w:t>
+      </w:r>
+      <w:r>
+        <w:rPr/>
+        <w:t>2</w:t>
+      </w:r>
+      <w:r>
+        <w:rPr/>
+        <w:t>:is</w:t>
+      </w:r>
+      <w:r>
+        <w:rPr/>
+        <w:t>2</w:t>
+      </w:r>
+      <w:r>
+        <w:rPr/>
+        <w:t xml:space="preserve">.uses&gt;malware.id} </w:t>
+      </w:r>
+      <w:commentRangeStart w:id="34"/>
+      <w:r>
+        <w:rPr/>
+        <w:t>{force m1.id=m2.id}</w:t>
+      </w:r>
+      <w:r>
+        <w:rPr/>
+      </w:r>
+      <w:commentRangeEnd w:id="34"/>
+      <w:r>
+        <w:commentReference w:id="34"/>
+      </w:r>
+      <w:r>
+        <w:rPr/>
+        <w:t xml:space="preserve"> {</w:t>
+      </w:r>
+      <w:r>
+        <w:rPr/>
+        <w:t xml:space="preserve">force </w:t>
+      </w:r>
+      <w:r>
+        <w:rPr/>
+        <w:t>m1.uses.</w:t>
+      </w:r>
+      <w:r>
+        <w:rPr/>
+        <w:t>id=ap1.id</w:t>
+      </w:r>
+      <w:r>
+        <w:rPr/>
+        <w:t>}</w:t>
+      </w:r>
+      <w:r>
+        <w:rPr/>
+        <w:t xml:space="preserve"> </w:t>
+      </w:r>
+      <w:r>
+        <w:rPr/>
+        <w:t xml:space="preserve">{ap1.id[_="T1027.013"]} </w:t>
+      </w:r>
+      <w:r>
+        <w:rPr/>
+        <w:t>*&gt;</w:t>
+      </w:r>
+    </w:p>
+    <w:p>
+      <w:pPr>
+        <w:pStyle w:val="BodyText"/>
+        <w:rPr/>
+      </w:pPr>
+      <w:r>
+        <w:rPr/>
+        <w:t>Schema: course-of-action - mitigates - attack-pattern, intrusion-set - uses - malware, malware - uses - attack-pattern</w:t>
+      </w:r>
+    </w:p>
+    <w:p>
+      <w:pPr>
+        <w:pStyle w:val="BodyText"/>
+        <w:spacing w:before="0" w:after="140"/>
+        <w:rPr/>
+      </w:pPr>
+      <w:r>
+        <w:rPr/>
       </w:r>
     </w:p>
     <w:sectPr>
@@ -4063,10 +3795,45 @@
 
 <file path=word/comments.xml><?xml version="1.0" encoding="utf-8"?>
 <w:comments xmlns:o="urn:schemas-microsoft-com:office:office" xmlns:r="http://schemas.openxmlformats.org/officeDocument/2006/relationships" xmlns:v="urn:schemas-microsoft-com:vml" xmlns:w="http://schemas.openxmlformats.org/wordprocessingml/2006/main" xmlns:w10="urn:schemas-microsoft-com:office:word" xmlns:wp="http://schemas.openxmlformats.org/drawingml/2006/wordprocessingDrawing" xmlns:wps="http://schemas.microsoft.com/office/word/2010/wordprocessingShape" xmlns:wpg="http://schemas.microsoft.com/office/word/2010/wordprocessingGroup" xmlns:mc="http://schemas.openxmlformats.org/markup-compatibility/2006" xmlns:wp14="http://schemas.microsoft.com/office/word/2010/wordprocessingDrawing" xmlns:w14="http://schemas.microsoft.com/office/word/2010/wordml" xmlns:w15="http://schemas.microsoft.com/office/word/2012/wordml" mc:Ignorable="w14 wp14 w15">
-  <w:comment w:id="0" w:author="I.C." w:date="2026-02-07T17:27:00Z" w:initials="I">
+  <w:comment w:id="0" w:author="I.C." w:date="2026-02-22T19:31:19Z" w:initials="I">
+    <w:p>
+      <w:pPr>
+        <w:overflowPunct w:val="false"/>
+        <w:rPr/>
+      </w:pPr>
+      <w:r>
+        <w:rPr>
+          <w:rFonts w:ascii="Liberation Serif" w:hAnsi="Liberation Serif" w:eastAsia="DejaVu Sans" w:cs="Noto Sans Arabic UI"/>
+          <w:kern w:val="0"/>
+          <w:lang w:val="en-US" w:eastAsia="en-US" w:bidi="en-US"/>
+        </w:rPr>
+        <w:t>modified to match revised ATT&amp;CK detection shema</w:t>
+      </w:r>
+    </w:p>
+  </w:comment>
+  <w:comment w:id="1" w:author="I.C." w:date="2026-02-22T21:09:02Z" w:initials="I">
     <w:p>
       <w:pPr>
         <w:overflowPunct w:val="true"/>
+        <w:bidi w:val="0"/>
+        <w:spacing w:before="0" w:after="0"/>
+        <w:jc w:val="start"/>
+        <w:rPr/>
+      </w:pPr>
+      <w:r>
+        <w:rPr>
+          <w:rFonts w:ascii="Liberation Serif" w:hAnsi="Liberation Serif" w:eastAsia="DejaVu Sans" w:cs="Noto Sans Arabic UI"/>
+          <w:kern w:val="0"/>
+          <w:lang w:val="en-US" w:eastAsia="en-US" w:bidi="en-US"/>
+        </w:rPr>
+        <w:t>modified to match revised ATT&amp;CK detection shema</w:t>
+      </w:r>
+    </w:p>
+  </w:comment>
+  <w:comment w:id="2" w:author="I.C." w:date="2026-02-07T17:27:00Z" w:initials="I">
+    <w:p>
+      <w:pPr>
+        <w:overflowPunct w:val="false"/>
         <w:bidi w:val="0"/>
         <w:rPr/>
       </w:pPr>
@@ -4084,7 +3851,7 @@
     </w:p>
     <w:p>
       <w:pPr>
-        <w:overflowPunct w:val="true"/>
+        <w:overflowPunct w:val="false"/>
         <w:bidi w:val="0"/>
         <w:rPr/>
       </w:pPr>
@@ -4101,10 +3868,10 @@
       </w:r>
     </w:p>
   </w:comment>
-  <w:comment w:id="1" w:author="I.C." w:date="2026-02-07T17:33:00Z" w:initials="I">
-    <w:p>
-      <w:pPr>
-        <w:overflowPunct w:val="true"/>
+  <w:comment w:id="3" w:author="I.C." w:date="2026-02-07T17:33:00Z" w:initials="I">
+    <w:p>
+      <w:pPr>
+        <w:overflowPunct w:val="false"/>
         <w:bidi w:val="0"/>
         <w:rPr/>
       </w:pPr>
@@ -4121,10 +3888,10 @@
       </w:r>
     </w:p>
   </w:comment>
-  <w:comment w:id="2" w:author="I.C." w:date="2026-02-07T17:40:00Z" w:initials="I">
-    <w:p>
-      <w:pPr>
-        <w:overflowPunct w:val="true"/>
+  <w:comment w:id="4" w:author="I.C." w:date="2026-02-07T17:40:00Z" w:initials="I">
+    <w:p>
+      <w:pPr>
+        <w:overflowPunct w:val="false"/>
         <w:bidi w:val="0"/>
         <w:rPr/>
       </w:pPr>
@@ -4141,10 +3908,10 @@
       </w:r>
     </w:p>
   </w:comment>
-  <w:comment w:id="3" w:author="I.C." w:date="2026-02-07T17:53:00Z" w:initials="I">
-    <w:p>
-      <w:pPr>
-        <w:overflowPunct w:val="true"/>
+  <w:comment w:id="5" w:author="I.C." w:date="2026-02-07T17:53:00Z" w:initials="I">
+    <w:p>
+      <w:pPr>
+        <w:overflowPunct w:val="false"/>
         <w:bidi w:val="0"/>
         <w:rPr/>
       </w:pPr>
@@ -4172,10 +3939,10 @@
       </w:r>
     </w:p>
   </w:comment>
-  <w:comment w:id="4" w:author="I.C." w:date="2026-02-13T14:02:00Z" w:initials="I">
-    <w:p>
-      <w:pPr>
-        <w:overflowPunct w:val="true"/>
+  <w:comment w:id="6" w:author="I.C." w:date="2026-02-07T17:54:00Z" w:initials="I">
+    <w:p>
+      <w:pPr>
+        <w:overflowPunct w:val="false"/>
         <w:bidi w:val="0"/>
         <w:rPr/>
       </w:pPr>
@@ -4188,14 +3955,33 @@
           <w:szCs w:val="24"/>
           <w:lang w:val="en-US" w:eastAsia="en-US" w:bidi="en-US"/>
         </w:rPr>
-        <w:t>&lt;* invisible section with constraints *&gt;</w:t>
+        <w:t>add support for substring check</w:t>
       </w:r>
     </w:p>
   </w:comment>
-  <w:comment w:id="5" w:author="I.C." w:date="2026-02-07T17:54:00Z" w:initials="I">
+  <w:comment w:id="7" w:author="I.C." w:date="2026-02-22T21:18:12Z" w:initials="I">
     <w:p>
       <w:pPr>
         <w:overflowPunct w:val="true"/>
+        <w:bidi w:val="0"/>
+        <w:spacing w:before="0" w:after="0"/>
+        <w:jc w:val="start"/>
+        <w:rPr/>
+      </w:pPr>
+      <w:r>
+        <w:rPr>
+          <w:rFonts w:ascii="Liberation Serif" w:hAnsi="Liberation Serif" w:eastAsia="DejaVu Sans" w:cs="Noto Sans Arabic UI"/>
+          <w:kern w:val="0"/>
+          <w:lang w:val="en-US" w:eastAsia="en-US" w:bidi="en-US"/>
+        </w:rPr>
+        <w:t>modified to match revised ATT&amp;CK detection shema</w:t>
+      </w:r>
+    </w:p>
+  </w:comment>
+  <w:comment w:id="8" w:author="I.C." w:date="2026-02-07T20:04:00Z" w:initials="I">
+    <w:p>
+      <w:pPr>
+        <w:overflowPunct w:val="false"/>
         <w:bidi w:val="0"/>
         <w:rPr/>
       </w:pPr>
@@ -4208,14 +3994,12 @@
           <w:szCs w:val="24"/>
           <w:lang w:val="en-US" w:eastAsia="en-US" w:bidi="en-US"/>
         </w:rPr>
-        <w:t>add support for substring check</w:t>
-      </w:r>
-    </w:p>
-  </w:comment>
-  <w:comment w:id="6" w:author="I.C." w:date="2026-02-07T20:04:00Z" w:initials="I">
-    <w:p>
-      <w:pPr>
-        <w:overflowPunct w:val="true"/>
+        <w:t>OR filtering not supported.</w:t>
+      </w:r>
+    </w:p>
+    <w:p>
+      <w:pPr>
+        <w:overflowPunct w:val="false"/>
         <w:bidi w:val="0"/>
         <w:rPr/>
       </w:pPr>
@@ -4228,12 +4012,14 @@
           <w:szCs w:val="24"/>
           <w:lang w:val="en-US" w:eastAsia="en-US" w:bidi="en-US"/>
         </w:rPr>
-        <w:t>OR filtering not supported.</w:t>
-      </w:r>
-    </w:p>
-    <w:p>
-      <w:pPr>
-        <w:overflowPunct w:val="true"/>
+        <w:t>Very specific condition. “protocol blending” not included in 4/2025 enterprise.json file.</w:t>
+      </w:r>
+    </w:p>
+  </w:comment>
+  <w:comment w:id="9" w:author="I.C." w:date="2026-02-07T20:05:00Z" w:initials="I">
+    <w:p>
+      <w:pPr>
+        <w:overflowPunct w:val="false"/>
         <w:bidi w:val="0"/>
         <w:rPr/>
       </w:pPr>
@@ -4246,14 +4032,14 @@
           <w:szCs w:val="24"/>
           <w:lang w:val="en-US" w:eastAsia="en-US" w:bidi="en-US"/>
         </w:rPr>
-        <w:t>Very specific condition. “protocol blending” not included in 4/2025 enterprise.json file.</w:t>
+        <w:t>non specific general template</w:t>
       </w:r>
     </w:p>
   </w:comment>
-  <w:comment w:id="7" w:author="I.C." w:date="2026-02-07T20:05:00Z" w:initials="I">
-    <w:p>
-      <w:pPr>
-        <w:overflowPunct w:val="true"/>
+  <w:comment w:id="10" w:author="I.C." w:date="2026-02-07T20:12:00Z" w:initials="I">
+    <w:p>
+      <w:pPr>
+        <w:overflowPunct w:val="false"/>
         <w:bidi w:val="0"/>
         <w:rPr/>
       </w:pPr>
@@ -4266,14 +4052,12 @@
           <w:szCs w:val="24"/>
           <w:lang w:val="en-US" w:eastAsia="en-US" w:bidi="en-US"/>
         </w:rPr>
-        <w:t>non specific general template</w:t>
-      </w:r>
-    </w:p>
-  </w:comment>
-  <w:comment w:id="8" w:author="I.C." w:date="2026-02-07T20:12:00Z" w:initials="I">
-    <w:p>
-      <w:pPr>
-        <w:overflowPunct w:val="true"/>
+        <w:t xml:space="preserve">Original was a malformed template. </w:t>
+      </w:r>
+    </w:p>
+    <w:p>
+      <w:pPr>
+        <w:overflowPunct w:val="false"/>
         <w:bidi w:val="0"/>
         <w:rPr/>
       </w:pPr>
@@ -4286,12 +4070,14 @@
           <w:szCs w:val="24"/>
           <w:lang w:val="en-US" w:eastAsia="en-US" w:bidi="en-US"/>
         </w:rPr>
-        <w:t xml:space="preserve">Original was a malformed template. </w:t>
-      </w:r>
-    </w:p>
-    <w:p>
-      <w:pPr>
-        <w:overflowPunct w:val="true"/>
+        <w:t>Edited to fit schema.</w:t>
+      </w:r>
+    </w:p>
+  </w:comment>
+  <w:comment w:id="11" w:author="I.C." w:date="2026-02-08T20:22:00Z" w:initials="I">
+    <w:p>
+      <w:pPr>
+        <w:overflowPunct w:val="false"/>
         <w:bidi w:val="0"/>
         <w:rPr/>
       </w:pPr>
@@ -4304,14 +4090,14 @@
           <w:szCs w:val="24"/>
           <w:lang w:val="en-US" w:eastAsia="en-US" w:bidi="en-US"/>
         </w:rPr>
-        <w:t>Edited to fit schema.</w:t>
+        <w:t>Modified to match current schema.</w:t>
       </w:r>
     </w:p>
   </w:comment>
-  <w:comment w:id="9" w:author="I.C." w:date="2026-02-08T20:22:00Z" w:initials="I">
-    <w:p>
-      <w:pPr>
-        <w:overflowPunct w:val="true"/>
+  <w:comment w:id="12" w:author="I.C." w:date="2026-02-08T20:21:00Z" w:initials="I">
+    <w:p>
+      <w:pPr>
+        <w:overflowPunct w:val="false"/>
         <w:bidi w:val="0"/>
         <w:rPr/>
       </w:pPr>
@@ -4324,14 +4110,14 @@
           <w:szCs w:val="24"/>
           <w:lang w:val="en-US" w:eastAsia="en-US" w:bidi="en-US"/>
         </w:rPr>
-        <w:t>Modified to match current schema.</w:t>
+        <w:t>Some cwe:Mitigations have no ID.</w:t>
       </w:r>
     </w:p>
   </w:comment>
-  <w:comment w:id="10" w:author="I.C." w:date="2026-02-08T20:21:00Z" w:initials="I">
-    <w:p>
-      <w:pPr>
-        <w:overflowPunct w:val="true"/>
+  <w:comment w:id="13" w:author="I.C." w:date="2026-02-09T17:14:00Z" w:initials="I">
+    <w:p>
+      <w:pPr>
+        <w:overflowPunct w:val="false"/>
         <w:bidi w:val="0"/>
         <w:rPr/>
       </w:pPr>
@@ -4344,14 +4130,12 @@
           <w:szCs w:val="24"/>
           <w:lang w:val="en-US" w:eastAsia="en-US" w:bidi="en-US"/>
         </w:rPr>
-        <w:t>Some cwe:Mitigations have no ID.</w:t>
-      </w:r>
-    </w:p>
-  </w:comment>
-  <w:comment w:id="11" w:author="I.C." w:date="2026-02-09T17:14:00Z" w:initials="I">
-    <w:p>
-      <w:pPr>
-        <w:overflowPunct w:val="true"/>
+        <w:t>Modified for new 10/2025 detection schema.</w:t>
+      </w:r>
+    </w:p>
+    <w:p>
+      <w:pPr>
+        <w:overflowPunct w:val="false"/>
         <w:bidi w:val="0"/>
         <w:rPr/>
       </w:pPr>
@@ -4364,14 +4148,14 @@
           <w:szCs w:val="24"/>
           <w:lang w:val="en-US" w:eastAsia="en-US" w:bidi="en-US"/>
         </w:rPr>
-        <w:t>Modified for node x-mitre-data-source.</w:t>
+        <w:t xml:space="preserve">Very similar to 2.2 </w:t>
       </w:r>
     </w:p>
   </w:comment>
-  <w:comment w:id="12" w:author="I.C." w:date="2026-02-09T17:24:00Z" w:initials="I">
-    <w:p>
-      <w:pPr>
-        <w:overflowPunct w:val="true"/>
+  <w:comment w:id="14" w:author="I.C." w:date="2026-02-09T17:24:00Z" w:initials="I">
+    <w:p>
+      <w:pPr>
+        <w:overflowPunct w:val="false"/>
         <w:bidi w:val="0"/>
         <w:rPr/>
       </w:pPr>
@@ -4388,7 +4172,7 @@
       </w:r>
       <w:r>
         <w:rPr>
-          <w:rFonts w:ascii="Liberation Serif" w:hAnsi="Liberation Serif" w:eastAsia="DejaVu Sans" w:cs=""/>
+          <w:rFonts w:eastAsia="DejaVu Sans" w:ascii="Liberation Serif" w:hAnsi="Liberation Serif" w:cs=""/>
           <w:color w:val="auto"/>
           <w:kern w:val="0"/>
           <w:sz w:val="20"/>
@@ -4399,10 +4183,10 @@
       </w:r>
     </w:p>
   </w:comment>
-  <w:comment w:id="13" w:author="I.C." w:date="2026-02-09T17:25:00Z" w:initials="I">
-    <w:p>
-      <w:pPr>
-        <w:overflowPunct w:val="true"/>
+  <w:comment w:id="15" w:author="I.C." w:date="2026-02-09T17:25:00Z" w:initials="I">
+    <w:p>
+      <w:pPr>
+        <w:overflowPunct w:val="false"/>
         <w:bidi w:val="0"/>
         <w:rPr/>
       </w:pPr>
@@ -4419,10 +4203,10 @@
       </w:r>
     </w:p>
   </w:comment>
-  <w:comment w:id="14" w:author="I.C." w:date="2026-02-09T17:27:00Z" w:initials="I">
-    <w:p>
-      <w:pPr>
-        <w:overflowPunct w:val="true"/>
+  <w:comment w:id="16" w:author="I.C." w:date="2026-02-09T17:27:00Z" w:initials="I">
+    <w:p>
+      <w:pPr>
+        <w:overflowPunct w:val="false"/>
         <w:bidi w:val="0"/>
         <w:rPr/>
       </w:pPr>
@@ -4439,10 +4223,10 @@
       </w:r>
     </w:p>
   </w:comment>
-  <w:comment w:id="15" w:author="I.C." w:date="2026-02-09T17:27:00Z" w:initials="I">
-    <w:p>
-      <w:pPr>
-        <w:overflowPunct w:val="true"/>
+  <w:comment w:id="17" w:author="I.C." w:date="2026-02-09T17:27:00Z" w:initials="I">
+    <w:p>
+      <w:pPr>
+        <w:overflowPunct w:val="false"/>
         <w:bidi w:val="0"/>
         <w:rPr/>
       </w:pPr>
@@ -4459,10 +4243,10 @@
       </w:r>
     </w:p>
   </w:comment>
-  <w:comment w:id="16" w:author="I.C." w:date="2026-02-09T18:39:00Z" w:initials="I">
-    <w:p>
-      <w:pPr>
-        <w:overflowPunct w:val="true"/>
+  <w:comment w:id="18" w:author="I.C." w:date="2026-02-09T18:39:00Z" w:initials="I">
+    <w:p>
+      <w:pPr>
+        <w:overflowPunct w:val="false"/>
         <w:bidi w:val="0"/>
         <w:rPr/>
       </w:pPr>
@@ -4479,10 +4263,10 @@
       </w:r>
     </w:p>
   </w:comment>
-  <w:comment w:id="17" w:author="I.C." w:date="2026-02-09T19:31:00Z" w:initials="I">
-    <w:p>
-      <w:pPr>
-        <w:overflowPunct w:val="true"/>
+  <w:comment w:id="19" w:author="I.C." w:date="2026-02-09T19:31:00Z" w:initials="I">
+    <w:p>
+      <w:pPr>
+        <w:overflowPunct w:val="false"/>
         <w:bidi w:val="0"/>
         <w:rPr/>
       </w:pPr>
@@ -4499,10 +4283,10 @@
       </w:r>
     </w:p>
   </w:comment>
-  <w:comment w:id="18" w:author="I.C." w:date="2026-02-09T20:05:00Z" w:initials="I">
-    <w:p>
-      <w:pPr>
-        <w:overflowPunct w:val="true"/>
+  <w:comment w:id="20" w:author="I.C." w:date="2026-02-09T20:05:00Z" w:initials="I">
+    <w:p>
+      <w:pPr>
+        <w:overflowPunct w:val="false"/>
         <w:bidi w:val="0"/>
         <w:rPr/>
       </w:pPr>
@@ -4519,10 +4303,10 @@
       </w:r>
     </w:p>
   </w:comment>
-  <w:comment w:id="19" w:author="I.C." w:date="2026-02-09T20:06:00Z" w:initials="I">
-    <w:p>
-      <w:pPr>
-        <w:overflowPunct w:val="true"/>
+  <w:comment w:id="21" w:author="I.C." w:date="2026-02-09T20:06:00Z" w:initials="I">
+    <w:p>
+      <w:pPr>
+        <w:overflowPunct w:val="false"/>
         <w:bidi w:val="0"/>
         <w:rPr/>
       </w:pPr>
@@ -4539,10 +4323,10 @@
       </w:r>
     </w:p>
   </w:comment>
-  <w:comment w:id="20" w:author="I.C." w:date="2026-02-11T17:48:00Z" w:initials="I">
-    <w:p>
-      <w:pPr>
-        <w:overflowPunct w:val="true"/>
+  <w:comment w:id="22" w:author="I.C." w:date="2026-02-11T17:48:00Z" w:initials="I">
+    <w:p>
+      <w:pPr>
+        <w:overflowPunct w:val="false"/>
         <w:bidi w:val="0"/>
         <w:rPr/>
       </w:pPr>
@@ -4559,10 +4343,10 @@
       </w:r>
     </w:p>
   </w:comment>
-  <w:comment w:id="21" w:author="I.C." w:date="2026-02-11T17:55:00Z" w:initials="I">
-    <w:p>
-      <w:pPr>
-        <w:overflowPunct w:val="true"/>
+  <w:comment w:id="23" w:author="I.C." w:date="2026-02-11T17:55:00Z" w:initials="I">
+    <w:p>
+      <w:pPr>
+        <w:overflowPunct w:val="false"/>
         <w:bidi w:val="0"/>
         <w:rPr/>
       </w:pPr>
@@ -4579,10 +4363,10 @@
       </w:r>
     </w:p>
   </w:comment>
-  <w:comment w:id="22" w:author="I.C." w:date="2026-02-13T13:44:00Z" w:initials="I">
-    <w:p>
-      <w:pPr>
-        <w:overflowPunct w:val="true"/>
+  <w:comment w:id="24" w:author="I.C." w:date="2026-02-13T13:44:00Z" w:initials="I">
+    <w:p>
+      <w:pPr>
+        <w:overflowPunct w:val="false"/>
         <w:bidi w:val="0"/>
         <w:rPr/>
       </w:pPr>
@@ -4599,10 +4383,10 @@
       </w:r>
     </w:p>
   </w:comment>
-  <w:comment w:id="23" w:author="I.C." w:date="2026-02-12T13:21:00Z" w:initials="I">
-    <w:p>
-      <w:pPr>
-        <w:overflowPunct w:val="true"/>
+  <w:comment w:id="25" w:author="I.C." w:date="2026-02-12T13:21:00Z" w:initials="I">
+    <w:p>
+      <w:pPr>
+        <w:overflowPunct w:val="false"/>
         <w:bidi w:val="0"/>
         <w:rPr/>
       </w:pPr>
@@ -4619,10 +4403,10 @@
       </w:r>
     </w:p>
   </w:comment>
-  <w:comment w:id="24" w:author="I.C." w:date="2026-01-29T21:13:00Z" w:initials="I">
-    <w:p>
-      <w:pPr>
-        <w:overflowPunct w:val="false"/>
+  <w:comment w:id="26" w:author="I.C." w:date="2026-01-29T21:13:00Z" w:initials="I">
+    <w:p>
+      <w:pPr>
+        <w:overflowPunct w:val="true"/>
         <w:bidi w:val="0"/>
         <w:jc w:val="start"/>
         <w:rPr/>
@@ -4640,10 +4424,10 @@
       </w:r>
     </w:p>
   </w:comment>
-  <w:comment w:id="25" w:author="I.C." w:date="2026-01-29T21:14:00Z" w:initials="I">
-    <w:p>
-      <w:pPr>
-        <w:overflowPunct w:val="false"/>
+  <w:comment w:id="27" w:author="I.C." w:date="2026-01-29T21:14:00Z" w:initials="I">
+    <w:p>
+      <w:pPr>
+        <w:overflowPunct w:val="true"/>
         <w:bidi w:val="0"/>
         <w:jc w:val="start"/>
         <w:rPr/>
@@ -4662,7 +4446,7 @@
     </w:p>
     <w:p>
       <w:pPr>
-        <w:overflowPunct w:val="false"/>
+        <w:overflowPunct w:val="true"/>
         <w:bidi w:val="0"/>
         <w:jc w:val="start"/>
         <w:rPr/>
@@ -4680,10 +4464,10 @@
       </w:r>
     </w:p>
   </w:comment>
-  <w:comment w:id="26" w:author="I.C." w:date="2026-02-13T11:27:00Z" w:initials="I">
-    <w:p>
-      <w:pPr>
-        <w:overflowPunct w:val="false"/>
+  <w:comment w:id="28" w:author="I.C." w:date="2026-02-13T11:27:00Z" w:initials="I">
+    <w:p>
+      <w:pPr>
+        <w:overflowPunct w:val="true"/>
         <w:bidi w:val="0"/>
         <w:jc w:val="start"/>
         <w:rPr/>
@@ -4702,7 +4486,7 @@
     </w:p>
     <w:p>
       <w:pPr>
-        <w:overflowPunct w:val="false"/>
+        <w:overflowPunct w:val="true"/>
         <w:bidi w:val="0"/>
         <w:jc w:val="start"/>
         <w:rPr/>
@@ -4720,10 +4504,10 @@
       </w:r>
     </w:p>
   </w:comment>
-  <w:comment w:id="27" w:author="I.C." w:date="2026-02-13T11:27:00Z" w:initials="I">
-    <w:p>
-      <w:pPr>
-        <w:overflowPunct w:val="false"/>
+  <w:comment w:id="29" w:author="I.C." w:date="2026-02-13T11:27:00Z" w:initials="I">
+    <w:p>
+      <w:pPr>
+        <w:overflowPunct w:val="true"/>
         <w:bidi w:val="0"/>
         <w:jc w:val="start"/>
         <w:rPr/>
@@ -4742,7 +4526,7 @@
     </w:p>
     <w:p>
       <w:pPr>
-        <w:overflowPunct w:val="false"/>
+        <w:overflowPunct w:val="true"/>
         <w:bidi w:val="0"/>
         <w:jc w:val="start"/>
         <w:rPr/>
@@ -4756,10 +4540,10 @@
       </w:r>
     </w:p>
   </w:comment>
-  <w:comment w:id="28" w:author="I.C." w:date="2026-02-13T11:33:00Z" w:initials="I">
-    <w:p>
-      <w:pPr>
-        <w:overflowPunct w:val="false"/>
+  <w:comment w:id="30" w:author="I.C." w:date="2026-02-13T11:33:00Z" w:initials="I">
+    <w:p>
+      <w:pPr>
+        <w:overflowPunct w:val="true"/>
         <w:bidi w:val="0"/>
         <w:jc w:val="start"/>
         <w:rPr/>
@@ -4778,7 +4562,7 @@
     </w:p>
     <w:p>
       <w:pPr>
-        <w:overflowPunct w:val="false"/>
+        <w:overflowPunct w:val="true"/>
         <w:bidi w:val="0"/>
         <w:jc w:val="start"/>
         <w:rPr/>
@@ -4792,10 +4576,10 @@
       </w:r>
     </w:p>
   </w:comment>
-  <w:comment w:id="29" w:author="I.C." w:date="2026-02-13T11:39:00Z" w:initials="I">
-    <w:p>
-      <w:pPr>
-        <w:overflowPunct w:val="false"/>
+  <w:comment w:id="31" w:author="I.C." w:date="2026-02-13T11:39:00Z" w:initials="I">
+    <w:p>
+      <w:pPr>
+        <w:overflowPunct w:val="true"/>
         <w:bidi w:val="0"/>
         <w:jc w:val="start"/>
         <w:rPr/>
@@ -4810,6 +4594,54 @@
           <w:lang w:val="en-US" w:eastAsia="en-US" w:bidi="en-US"/>
         </w:rPr>
         <w:t>Not ENGAGE-specific.</w:t>
+      </w:r>
+    </w:p>
+  </w:comment>
+  <w:comment w:id="32" w:author="I.C." w:date="2026-02-20T09:14:58Z" w:initials="I">
+    <w:p>
+      <w:pPr>
+        <w:overflowPunct w:val="false"/>
+        <w:rPr/>
+      </w:pPr>
+      <w:r>
+        <w:rPr>
+          <w:rFonts w:ascii="Liberation Serif" w:hAnsi="Liberation Serif" w:eastAsia="DejaVu Sans" w:cs="Noto Sans Arabic UI"/>
+          <w:kern w:val="0"/>
+          <w:lang w:val="en-US" w:eastAsia="en-US" w:bidi="en-US"/>
+        </w:rPr>
+        <w:t>this is an inverse edge; the originating node is implicit (a coa)</w:t>
+      </w:r>
+    </w:p>
+  </w:comment>
+  <w:comment w:id="33" w:author="I.C." w:date="2026-02-20T09:12:05Z" w:initials="I">
+    <w:p>
+      <w:pPr>
+        <w:overflowPunct w:val="false"/>
+        <w:rPr/>
+      </w:pPr>
+      <w:r>
+        <w:rPr>
+          <w:rFonts w:ascii="Liberation Serif" w:hAnsi="Liberation Serif" w:eastAsia="DejaVu Sans" w:cs="Noto Sans Arabic UI"/>
+          <w:kern w:val="0"/>
+          <w:lang w:val="en-US" w:eastAsia="en-US" w:bidi="en-US"/>
+        </w:rPr>
+        <w:t>join on same ap.</w:t>
+      </w:r>
+    </w:p>
+  </w:comment>
+  <w:comment w:id="34" w:author="I.C." w:date="2026-02-20T09:12:42Z" w:initials="I">
+    <w:p>
+      <w:pPr>
+        <w:overflowPunct w:val="false"/>
+        <w:rPr/>
+      </w:pPr>
+      <w:r>
+        <w:rPr>
+          <w:rFonts w:ascii="Liberation Serif" w:hAnsi="Liberation Serif" w:eastAsia="DejaVu Sans" w:cs="Noto Sans Arabic UI"/>
+          <w:kern w:val="0"/>
+          <w:lang w:val="en-US" w:eastAsia="en-US" w:bidi="en-US"/>
+        </w:rPr>
+        <w:t>join on same malware.</w:t>
       </w:r>
     </w:p>
   </w:comment>
@@ -5097,7 +4929,7 @@
     <w:pPr>
       <w:widowControl/>
       <w:suppressAutoHyphens w:val="true"/>
-      <w:overflowPunct w:val="false"/>
+      <w:overflowPunct w:val="true"/>
       <w:bidi w:val="0"/>
       <w:spacing w:before="0" w:after="0"/>
       <w:jc w:val="start"/>

</xml_diff>